<commit_message>
update docs, minivan season
</commit_message>
<xml_diff>
--- a/public/docs/Договор_3797.docx
+++ b/public/docs/Договор_3797.docx
@@ -1,6 +1,6 @@
 
 <file path=word/document.xml><?xml version="1.0" encoding="utf-8"?>
-<w:document xmlns:wpc="http://schemas.microsoft.com/office/word/2010/wordprocessingCanvas" xmlns:cx="http://schemas.microsoft.com/office/drawing/2014/chartex" xmlns:cx1="http://schemas.microsoft.com/office/drawing/2015/9/8/chartex" xmlns:mc="http://schemas.openxmlformats.org/markup-compatibility/2006" xmlns:o="urn:schemas-microsoft-com:office:office" xmlns:r="http://schemas.openxmlformats.org/officeDocument/2006/relationships" xmlns:m="http://schemas.openxmlformats.org/officeDocument/2006/math" xmlns:v="urn:schemas-microsoft-com:vml" xmlns:wp14="http://schemas.microsoft.com/office/word/2010/wordprocessingDrawing" xmlns:wp="http://schemas.openxmlformats.org/drawingml/2006/wordprocessingDrawing" xmlns:w10="urn:schemas-microsoft-com:office:word" xmlns:w="http://schemas.openxmlformats.org/wordprocessingml/2006/main" xmlns:w14="http://schemas.microsoft.com/office/word/2010/wordml" xmlns:w15="http://schemas.microsoft.com/office/word/2012/wordml" xmlns:w16se="http://schemas.microsoft.com/office/word/2015/wordml/symex" xmlns:wpg="http://schemas.microsoft.com/office/word/2010/wordprocessingGroup" xmlns:wpi="http://schemas.microsoft.com/office/word/2010/wordprocessingInk" xmlns:wne="http://schemas.microsoft.com/office/word/2006/wordml" xmlns:wps="http://schemas.microsoft.com/office/word/2010/wordprocessingShape" mc:Ignorable="w14 w15 w16se wp14">
+<w:document xmlns:ve="http://schemas.openxmlformats.org/markup-compatibility/2006" xmlns:o="urn:schemas-microsoft-com:office:office" xmlns:r="http://schemas.openxmlformats.org/officeDocument/2006/relationships" xmlns:m="http://schemas.openxmlformats.org/officeDocument/2006/math" xmlns:v="urn:schemas-microsoft-com:vml" xmlns:wp="http://schemas.openxmlformats.org/drawingml/2006/wordprocessingDrawing" xmlns:w10="urn:schemas-microsoft-com:office:word" xmlns:w="http://schemas.openxmlformats.org/wordprocessingml/2006/main" xmlns:wne="http://schemas.microsoft.com/office/word/2006/wordml">
   <w:body>
     <w:p>
       <w:pPr>
@@ -12,29 +12,30 @@
         <w:spacing w:before="240" w:after="60"/>
         <w:rPr>
           <w:b/>
-          <w:sz w:val="16"/>
-          <w:szCs w:val="16"/>
-        </w:rPr>
-      </w:pPr>
-      <w:r>
-        <w:rPr>
+          <w:sz w:val="18"/>
+          <w:szCs w:val="18"/>
+        </w:rPr>
+      </w:pPr>
+      <w:r>
+        <w:rPr>
+          <w:b/>
           <w:noProof/>
-          <w:sz w:val="16"/>
-          <w:szCs w:val="16"/>
+          <w:sz w:val="18"/>
+          <w:szCs w:val="18"/>
         </w:rPr>
         <w:drawing>
-          <wp:anchor distT="0" distB="0" distL="114300" distR="114300" simplePos="0" relativeHeight="251658752" behindDoc="0" locked="0" layoutInCell="1" allowOverlap="1" wp14:anchorId="510DA7A8" wp14:editId="13E5B23F">
+          <wp:anchor distT="0" distB="0" distL="114300" distR="114300" simplePos="0" relativeHeight="251658752" behindDoc="0" locked="0" layoutInCell="1" allowOverlap="1">
             <wp:simplePos x="0" y="0"/>
             <wp:positionH relativeFrom="column">
-              <wp:posOffset>4752975</wp:posOffset>
+              <wp:posOffset>4743450</wp:posOffset>
             </wp:positionH>
             <wp:positionV relativeFrom="paragraph">
-              <wp:posOffset>107950</wp:posOffset>
+              <wp:posOffset>106680</wp:posOffset>
             </wp:positionV>
-            <wp:extent cx="1894840" cy="454025"/>
-            <wp:effectExtent l="0" t="0" r="0" b="0"/>
+            <wp:extent cx="1908810" cy="457200"/>
+            <wp:effectExtent l="19050" t="0" r="0" b="0"/>
             <wp:wrapSquare wrapText="bothSides"/>
-            <wp:docPr id="4" name="Рисунок 4" descr="C:\Users\Mikhail\AppData\Local\Microsoft\Windows\INetCache\Content.Word\4142_vector.png"/>
+            <wp:docPr id="12" name="Рисунок 4" descr="4142_vector"/>
             <wp:cNvGraphicFramePr>
               <a:graphicFrameLocks xmlns:a="http://schemas.openxmlformats.org/drawingml/2006/main" noChangeAspect="1"/>
             </wp:cNvGraphicFramePr>
@@ -42,19 +43,13 @@
               <a:graphicData uri="http://schemas.openxmlformats.org/drawingml/2006/picture">
                 <pic:pic xmlns:pic="http://schemas.openxmlformats.org/drawingml/2006/picture">
                   <pic:nvPicPr>
-                    <pic:cNvPr id="0" name="Picture 10" descr="C:\Users\Mikhail\AppData\Local\Microsoft\Windows\INetCache\Content.Word\4142_vector.png"/>
+                    <pic:cNvPr id="0" name="Рисунок 4" descr="4142_vector"/>
                     <pic:cNvPicPr>
                       <a:picLocks noChangeAspect="1" noChangeArrowheads="1"/>
                     </pic:cNvPicPr>
                   </pic:nvPicPr>
                   <pic:blipFill>
-                    <a:blip r:embed="rId8" cstate="print">
-                      <a:extLst>
-                        <a:ext uri="{28A0092B-C50C-407E-A947-70E740481C1C}">
-                          <a14:useLocalDpi xmlns:a14="http://schemas.microsoft.com/office/drawing/2010/main" val="0"/>
-                        </a:ext>
-                      </a:extLst>
-                    </a:blip>
+                    <a:blip r:embed="rId8"/>
                     <a:srcRect/>
                     <a:stretch>
                       <a:fillRect/>
@@ -63,77 +58,26 @@
                   <pic:spPr bwMode="auto">
                     <a:xfrm>
                       <a:off x="0" y="0"/>
-                      <a:ext cx="1894840" cy="454025"/>
+                      <a:ext cx="1908810" cy="457200"/>
                     </a:xfrm>
                     <a:prstGeom prst="rect">
                       <a:avLst/>
                     </a:prstGeom>
                     <a:noFill/>
-                    <a:ln>
-                      <a:noFill/>
-                    </a:ln>
                   </pic:spPr>
                 </pic:pic>
               </a:graphicData>
             </a:graphic>
-            <wp14:sizeRelH relativeFrom="margin">
-              <wp14:pctWidth>0</wp14:pctWidth>
-            </wp14:sizeRelH>
-            <wp14:sizeRelV relativeFrom="margin">
-              <wp14:pctHeight>0</wp14:pctHeight>
-            </wp14:sizeRelV>
           </wp:anchor>
         </w:drawing>
       </w:r>
       <w:r>
         <w:rPr>
           <w:b/>
-          <w:sz w:val="16"/>
-          <w:szCs w:val="16"/>
-        </w:rPr>
-        <w:t xml:space="preserve">Прокат </w:t>
-      </w:r>
-      <w:proofErr w:type="gramStart"/>
-      <w:r>
-        <w:rPr>
-          <w:b/>
-          <w:sz w:val="16"/>
-          <w:szCs w:val="16"/>
-        </w:rPr>
-        <w:t xml:space="preserve">автомобилей </w:t>
-      </w:r>
-      <w:r>
-        <w:rPr>
-          <w:b/>
-          <w:sz w:val="16"/>
-          <w:szCs w:val="16"/>
-        </w:rPr>
-        <w:t xml:space="preserve"> «</w:t>
-      </w:r>
-      <w:proofErr w:type="gramEnd"/>
-      <w:r>
-        <w:rPr>
-          <w:b/>
-          <w:sz w:val="16"/>
-          <w:szCs w:val="16"/>
-        </w:rPr>
-        <w:t>РЕ</w:t>
-      </w:r>
-      <w:r>
-        <w:rPr>
-          <w:b/>
-          <w:sz w:val="16"/>
-          <w:szCs w:val="16"/>
-        </w:rPr>
-        <w:t>НТАСИБ»</w:t>
-      </w:r>
-      <w:r>
-        <w:rPr>
-          <w:noProof/>
-          <w:sz w:val="16"/>
-          <w:szCs w:val="16"/>
-        </w:rPr>
-        <w:t xml:space="preserve"> </w:t>
+          <w:sz w:val="18"/>
+          <w:szCs w:val="18"/>
+        </w:rPr>
+        <w:t>Прокат автомобилей  «РЕНТАСИБ»</w:t>
       </w:r>
     </w:p>
     <w:p>
@@ -145,35 +89,25 @@
         </w:tabs>
         <w:rPr>
           <w:b/>
-          <w:sz w:val="16"/>
-          <w:szCs w:val="16"/>
-        </w:rPr>
-      </w:pPr>
-      <w:r>
-        <w:rPr>
-          <w:b/>
-          <w:sz w:val="16"/>
-          <w:szCs w:val="16"/>
-        </w:rPr>
-        <w:t>Телефон: +7(913</w:t>
-      </w:r>
-      <w:proofErr w:type="gramStart"/>
-      <w:r>
-        <w:rPr>
-          <w:b/>
-          <w:sz w:val="16"/>
-          <w:szCs w:val="16"/>
-        </w:rPr>
-        <w:t>)  913</w:t>
-      </w:r>
-      <w:proofErr w:type="gramEnd"/>
-      <w:r>
-        <w:rPr>
-          <w:b/>
-          <w:sz w:val="16"/>
-          <w:szCs w:val="16"/>
-        </w:rPr>
-        <w:t>- 28- 08</w:t>
+          <w:sz w:val="18"/>
+          <w:szCs w:val="18"/>
+        </w:rPr>
+      </w:pPr>
+      <w:r>
+        <w:rPr>
+          <w:b/>
+          <w:sz w:val="18"/>
+          <w:szCs w:val="18"/>
+        </w:rPr>
+        <w:t>Телефон: +7 (913) 913-28-</w:t>
+      </w:r>
+      <w:r>
+        <w:rPr>
+          <w:b/>
+          <w:sz w:val="18"/>
+          <w:szCs w:val="18"/>
+        </w:rPr>
+        <w:t>08</w:t>
       </w:r>
     </w:p>
     <w:p>
@@ -185,41 +119,16 @@
         </w:tabs>
         <w:spacing w:after="60"/>
         <w:rPr>
-          <w:sz w:val="16"/>
-          <w:szCs w:val="16"/>
-        </w:rPr>
-      </w:pPr>
-      <w:r>
-        <w:rPr>
-          <w:sz w:val="16"/>
-          <w:szCs w:val="16"/>
-        </w:rPr>
-        <w:t xml:space="preserve">630102, г. Новосибирск, ул. </w:t>
-      </w:r>
-      <w:proofErr w:type="spellStart"/>
-      <w:proofErr w:type="gramStart"/>
-      <w:r>
-        <w:rPr>
-          <w:sz w:val="16"/>
-          <w:szCs w:val="16"/>
-        </w:rPr>
-        <w:t>Инская</w:t>
-      </w:r>
-      <w:proofErr w:type="spellEnd"/>
-      <w:r>
-        <w:rPr>
-          <w:sz w:val="16"/>
-          <w:szCs w:val="16"/>
-        </w:rPr>
-        <w:t>,  д.</w:t>
-      </w:r>
-      <w:proofErr w:type="gramEnd"/>
-      <w:r>
-        <w:rPr>
-          <w:sz w:val="16"/>
-          <w:szCs w:val="16"/>
-        </w:rPr>
-        <w:t xml:space="preserve"> 3 , офис 18</w:t>
+          <w:sz w:val="18"/>
+          <w:szCs w:val="18"/>
+        </w:rPr>
+      </w:pPr>
+      <w:r>
+        <w:rPr>
+          <w:sz w:val="18"/>
+          <w:szCs w:val="18"/>
+        </w:rPr>
+        <w:t>630102, г. Новосибирск, ул. Инская,  д. 3 , офис 18</w:t>
       </w:r>
     </w:p>
     <w:p>
@@ -266,7 +175,6 @@
           <w:b/>
         </w:rPr>
       </w:pPr>
-      <w:proofErr w:type="gramStart"/>
       <w:r>
         <w:rPr>
           <w:b/>
@@ -279,7 +187,6 @@
         </w:rPr>
         <w:t xml:space="preserve">  №</w:t>
       </w:r>
-      <w:proofErr w:type="gramEnd"/>
       <w:r>
         <w:rPr>
           <w:b/>
@@ -327,11 +234,11 @@
           <w:insideH w:val="single" w:sz="4" w:space="0" w:color="auto"/>
           <w:insideV w:val="single" w:sz="4" w:space="0" w:color="auto"/>
         </w:tblBorders>
-        <w:tblLook w:val="04A0" w:firstRow="1" w:lastRow="0" w:firstColumn="1" w:lastColumn="0" w:noHBand="0" w:noVBand="1"/>
+        <w:tblLook w:val="04A0"/>
       </w:tblPr>
       <w:tblGrid>
-        <w:gridCol w:w="3759"/>
-        <w:gridCol w:w="6707"/>
+        <w:gridCol w:w="3826"/>
+        <w:gridCol w:w="6856"/>
       </w:tblGrid>
       <w:tr>
         <w:tc>
@@ -364,7 +271,6 @@
               </w:rPr>
               <w:t xml:space="preserve">г. </w:t>
             </w:r>
-            <w:proofErr w:type="spellStart"/>
             <w:r>
               <w:rPr>
                 <w:rFonts w:eastAsia="ArialNarrow"/>
@@ -374,7 +280,6 @@
               </w:rPr>
               <w:t>Новосибирск</w:t>
             </w:r>
-            <w:proofErr w:type="spellEnd"/>
           </w:p>
         </w:tc>
         <w:tc>
@@ -424,16 +329,13 @@
               </w:rPr>
               <w:t xml:space="preserve">» </w:t>
             </w:r>
-            <w:proofErr w:type="spellStart"/>
             <w:r>
               <w:rPr>
                 <w:sz w:val="18"/>
                 <w:szCs w:val="16"/>
-                <w:lang w:val="en-US"/>
-              </w:rPr>
-              <w:t>сентября</w:t>
-            </w:r>
-            <w:proofErr w:type="spellEnd"/>
+              </w:rPr>
+              <w:t>октября</w:t>
+            </w:r>
             <w:r>
               <w:rPr>
                 <w:sz w:val="18"/>
@@ -484,41 +386,7 @@
           <w:sz w:val="18"/>
           <w:szCs w:val="18"/>
         </w:rPr>
-        <w:t>Общество с ограниченной ответственностью "</w:t>
-      </w:r>
-      <w:proofErr w:type="spellStart"/>
-      <w:r>
-        <w:rPr>
-          <w:b/>
-          <w:sz w:val="18"/>
-          <w:szCs w:val="18"/>
-        </w:rPr>
-        <w:t>Рентасиб</w:t>
-      </w:r>
-      <w:proofErr w:type="spellEnd"/>
-      <w:proofErr w:type="gramStart"/>
-      <w:r>
-        <w:rPr>
-          <w:b/>
-          <w:sz w:val="18"/>
-          <w:szCs w:val="18"/>
-        </w:rPr>
-        <w:t>"</w:t>
-      </w:r>
-      <w:r>
-        <w:rPr>
-          <w:sz w:val="18"/>
-          <w:szCs w:val="18"/>
-        </w:rPr>
-        <w:t xml:space="preserve">  в</w:t>
-      </w:r>
-      <w:proofErr w:type="gramEnd"/>
-      <w:r>
-        <w:rPr>
-          <w:sz w:val="18"/>
-          <w:szCs w:val="18"/>
-        </w:rPr>
-        <w:t xml:space="preserve"> лице Директора Зайцева Сергея Леонидовича, действующего на основании Устава,</w:t>
+        <w:t>Общество с ограниченной ответственностью "Рентасиб"</w:t>
       </w:r>
       <w:r>
         <w:rPr>
@@ -532,6 +400,55 @@
           <w:sz w:val="18"/>
           <w:szCs w:val="18"/>
         </w:rPr>
+        <w:t xml:space="preserve"> в лице </w:t>
+      </w:r>
+      <w:r>
+        <w:rPr>
+          <w:sz w:val="18"/>
+          <w:szCs w:val="18"/>
+        </w:rPr>
+        <w:t>Директора Зайцева Сергея Леонидовича</w:t>
+      </w:r>
+      <w:r>
+        <w:rPr>
+          <w:sz w:val="18"/>
+          <w:szCs w:val="18"/>
+        </w:rPr>
+        <w:t>,</w:t>
+      </w:r>
+      <w:r>
+        <w:rPr>
+          <w:sz w:val="18"/>
+          <w:szCs w:val="18"/>
+        </w:rPr>
+        <w:t xml:space="preserve"> действующего на основании</w:t>
+      </w:r>
+      <w:r>
+        <w:rPr>
+          <w:sz w:val="18"/>
+          <w:szCs w:val="18"/>
+        </w:rPr>
+        <w:t xml:space="preserve"> Устава</w:t>
+      </w:r>
+      <w:r>
+        <w:rPr>
+          <w:sz w:val="18"/>
+          <w:szCs w:val="18"/>
+        </w:rPr>
+        <w:t>,</w:t>
+      </w:r>
+      <w:r>
+        <w:rPr>
+          <w:sz w:val="18"/>
+          <w:szCs w:val="18"/>
+        </w:rPr>
+        <w:t xml:space="preserve"> </w:t>
+      </w:r>
+      <w:r>
+        <w:rPr>
+          <w:sz w:val="18"/>
+          <w:szCs w:val="18"/>
+        </w:rPr>
         <w:t xml:space="preserve"> и именуемым в дальнейшем </w:t>
       </w:r>
       <w:r>
@@ -547,7 +464,21 @@
           <w:sz w:val="18"/>
           <w:szCs w:val="18"/>
         </w:rPr>
-        <w:t xml:space="preserve">, с одной стороны, и </w:t>
+        <w:t>,</w:t>
+      </w:r>
+      <w:r>
+        <w:rPr>
+          <w:sz w:val="18"/>
+          <w:szCs w:val="18"/>
+        </w:rPr>
+        <w:t xml:space="preserve"> </w:t>
+      </w:r>
+      <w:r>
+        <w:rPr>
+          <w:sz w:val="18"/>
+          <w:szCs w:val="18"/>
+        </w:rPr>
+        <w:t xml:space="preserve">с одной стороны, и </w:t>
       </w:r>
     </w:p>
     <w:tbl>
@@ -562,12 +493,12 @@
           <w:insideH w:val="single" w:sz="4" w:space="0" w:color="auto"/>
           <w:insideV w:val="single" w:sz="4" w:space="0" w:color="auto"/>
         </w:tblBorders>
-        <w:tblLook w:val="04A0" w:firstRow="1" w:lastRow="0" w:firstColumn="1" w:lastColumn="0" w:noHBand="0" w:noVBand="1"/>
+        <w:tblLook w:val="04A0"/>
       </w:tblPr>
       <w:tblGrid>
-        <w:gridCol w:w="3163"/>
-        <w:gridCol w:w="3264"/>
-        <w:gridCol w:w="3921"/>
+        <w:gridCol w:w="3230"/>
+        <w:gridCol w:w="3335"/>
+        <w:gridCol w:w="4009"/>
       </w:tblGrid>
       <w:tr>
         <w:tc>
@@ -644,7 +575,14 @@
                 <w:sz w:val="18"/>
                 <w:szCs w:val="18"/>
               </w:rPr>
-              <w:t>В/У 99 13 777777, выдано ГИБДД 7777</w:t>
+              <w:t xml:space="preserve">В/У </w:t>
+            </w:r>
+            <w:r>
+              <w:rPr>
+                <w:sz w:val="18"/>
+                <w:szCs w:val="18"/>
+              </w:rPr>
+              <w:t>99 13 777777, выдано ГИБДД 7777</w:t>
             </w:r>
             <w:r>
               <w:rPr>
@@ -684,14 +622,37 @@
           <w:sz w:val="18"/>
           <w:szCs w:val="18"/>
         </w:rPr>
-        <w:t>«Арендатор»</w:t>
-      </w:r>
-      <w:r>
-        <w:rPr>
-          <w:sz w:val="18"/>
-          <w:szCs w:val="18"/>
-        </w:rPr>
-        <w:t xml:space="preserve">, с другой стороны, совместно именуемые «Стороны», заключили настоящий Договор о нижеследующем. </w:t>
+        <w:t>«</w:t>
+      </w:r>
+      <w:r>
+        <w:rPr>
+          <w:b/>
+          <w:sz w:val="18"/>
+          <w:szCs w:val="18"/>
+        </w:rPr>
+        <w:t>Арендатор</w:t>
+      </w:r>
+      <w:r>
+        <w:rPr>
+          <w:b/>
+          <w:sz w:val="18"/>
+          <w:szCs w:val="18"/>
+        </w:rPr>
+        <w:t>»</w:t>
+      </w:r>
+      <w:r>
+        <w:rPr>
+          <w:sz w:val="18"/>
+          <w:szCs w:val="18"/>
+        </w:rPr>
+        <w:t>, с другой стороны</w:t>
+      </w:r>
+      <w:r>
+        <w:rPr>
+          <w:sz w:val="18"/>
+          <w:szCs w:val="18"/>
+        </w:rPr>
+        <w:t xml:space="preserve">, совместно именуемые «Стороны», заключили настоящий Договор о нижеследующем. </w:t>
       </w:r>
     </w:p>
     <w:p>
@@ -752,7 +713,15 @@
           <w:sz w:val="18"/>
           <w:szCs w:val="18"/>
         </w:rPr>
-        <w:t>Арендодатель</w:t>
+        <w:t>А</w:t>
+      </w:r>
+      <w:r>
+        <w:rPr>
+          <w:b/>
+          <w:sz w:val="18"/>
+          <w:szCs w:val="18"/>
+        </w:rPr>
+        <w:t>рендодатель</w:t>
       </w:r>
       <w:r>
         <w:rPr>
@@ -782,14 +751,51 @@
           <w:sz w:val="18"/>
           <w:szCs w:val="18"/>
         </w:rPr>
-        <w:t>Приложении № 1</w:t>
-      </w:r>
-      <w:r>
-        <w:rPr>
-          <w:sz w:val="18"/>
-          <w:szCs w:val="18"/>
-        </w:rPr>
-        <w:t xml:space="preserve"> к настоящему Договору, за плату без оказания услуг по управлению им и его технической эксплуатации.</w:t>
+        <w:t>Приложении №</w:t>
+      </w:r>
+      <w:r>
+        <w:rPr>
+          <w:b/>
+          <w:sz w:val="18"/>
+          <w:szCs w:val="18"/>
+        </w:rPr>
+        <w:t xml:space="preserve"> </w:t>
+      </w:r>
+      <w:r>
+        <w:rPr>
+          <w:b/>
+          <w:sz w:val="18"/>
+          <w:szCs w:val="18"/>
+        </w:rPr>
+        <w:t>1</w:t>
+      </w:r>
+      <w:r>
+        <w:rPr>
+          <w:sz w:val="18"/>
+          <w:szCs w:val="18"/>
+        </w:rPr>
+        <w:t xml:space="preserve"> к настоящему Договору, за плату без </w:t>
+      </w:r>
+      <w:r>
+        <w:rPr>
+          <w:sz w:val="18"/>
+          <w:szCs w:val="18"/>
+        </w:rPr>
+        <w:t xml:space="preserve">оказания услуг по управлению им и его технической </w:t>
+      </w:r>
+      <w:r>
+        <w:rPr>
+          <w:sz w:val="18"/>
+          <w:szCs w:val="18"/>
+        </w:rPr>
+        <w:t>эксплуатации</w:t>
+      </w:r>
+      <w:r>
+        <w:rPr>
+          <w:sz w:val="18"/>
+          <w:szCs w:val="18"/>
+        </w:rPr>
+        <w:t>.</w:t>
       </w:r>
       <w:r>
         <w:rPr>
@@ -811,7 +817,7 @@
           <w:insideH w:val="single" w:sz="4" w:space="0" w:color="auto"/>
           <w:insideV w:val="single" w:sz="4" w:space="0" w:color="auto"/>
         </w:tblBorders>
-        <w:tblLook w:val="0000" w:firstRow="0" w:lastRow="0" w:firstColumn="0" w:lastColumn="0" w:noHBand="0" w:noVBand="0"/>
+        <w:tblLook w:val="0000"/>
       </w:tblPr>
       <w:tblGrid>
         <w:gridCol w:w="4979"/>
@@ -915,7 +921,21 @@
           <w:sz w:val="18"/>
           <w:szCs w:val="18"/>
         </w:rPr>
-        <w:t xml:space="preserve"> обязуется выплачивать арендную плату в соответствии с утвержденным прейскурантом, в порядке и на условиях, согласованных сторонами в настоящем Договоре.</w:t>
+        <w:t xml:space="preserve"> обязуе</w:t>
+      </w:r>
+      <w:r>
+        <w:rPr>
+          <w:sz w:val="18"/>
+          <w:szCs w:val="18"/>
+        </w:rPr>
+        <w:t xml:space="preserve">тся выплачивать арендную плату </w:t>
+      </w:r>
+      <w:r>
+        <w:rPr>
+          <w:sz w:val="18"/>
+          <w:szCs w:val="18"/>
+        </w:rPr>
+        <w:t>в соответствии с утвержденным прейскурантом, в порядке и на условиях, согласованных сторонами в настоящем Договоре.</w:t>
       </w:r>
     </w:p>
     <w:p>
@@ -939,7 +959,28 @@
           <w:sz w:val="18"/>
           <w:szCs w:val="18"/>
         </w:rPr>
-        <w:t>Исполнение Сторонами обязательств по настоящему договору не влечет перехода права собственности на транспортное средство к Арендатору.</w:t>
+        <w:t xml:space="preserve">Исполнение Сторонами обязательств по </w:t>
+      </w:r>
+      <w:r>
+        <w:rPr>
+          <w:sz w:val="18"/>
+          <w:szCs w:val="18"/>
+        </w:rPr>
+        <w:t>настоящему договору не влечет перехода права собственности на тран</w:t>
+      </w:r>
+      <w:r>
+        <w:rPr>
+          <w:sz w:val="18"/>
+          <w:szCs w:val="18"/>
+        </w:rPr>
+        <w:t>спортное средство к Арендатору</w:t>
+      </w:r>
+      <w:r>
+        <w:rPr>
+          <w:sz w:val="18"/>
+          <w:szCs w:val="18"/>
+        </w:rPr>
+        <w:t>.</w:t>
       </w:r>
     </w:p>
     <w:p>
@@ -979,23 +1020,47 @@
           <w:sz w:val="18"/>
           <w:szCs w:val="18"/>
         </w:rPr>
-        <w:t>01.09.2026, 09:0</w:t>
-      </w:r>
-      <w:r>
-        <w:rPr>
-          <w:b/>
-          <w:sz w:val="18"/>
-          <w:szCs w:val="18"/>
-        </w:rPr>
-        <w:t xml:space="preserve">0 по </w:t>
-      </w:r>
-      <w:r>
-        <w:rPr>
-          <w:b/>
-          <w:sz w:val="18"/>
-          <w:szCs w:val="18"/>
-        </w:rPr>
-        <w:t>30.09.2026, 20</w:t>
+        <w:t>01.10</w:t>
+      </w:r>
+      <w:r>
+        <w:rPr>
+          <w:b/>
+          <w:sz w:val="18"/>
+          <w:szCs w:val="18"/>
+        </w:rPr>
+        <w:t>.2026, 09:0</w:t>
+      </w:r>
+      <w:r>
+        <w:rPr>
+          <w:b/>
+          <w:sz w:val="18"/>
+          <w:szCs w:val="18"/>
+        </w:rPr>
+        <w:t xml:space="preserve">0 </w:t>
+      </w:r>
+      <w:r>
+        <w:rPr>
+          <w:b/>
+          <w:sz w:val="18"/>
+          <w:szCs w:val="18"/>
+        </w:rPr>
+        <w:t xml:space="preserve">по </w:t>
+      </w:r>
+      <w:r>
+        <w:rPr>
+          <w:b/>
+          <w:sz w:val="18"/>
+          <w:szCs w:val="18"/>
+        </w:rPr>
+        <w:t>31.10</w:t>
+      </w:r>
+      <w:r>
+        <w:rPr>
+          <w:b/>
+          <w:sz w:val="18"/>
+          <w:szCs w:val="18"/>
+        </w:rPr>
+        <w:t>.2026, 20</w:t>
       </w:r>
       <w:r>
         <w:rPr>
@@ -1109,25 +1174,66 @@
           <w:sz w:val="18"/>
           <w:szCs w:val="18"/>
         </w:rPr>
-        <w:t xml:space="preserve">1.6 Арендная плата: </w:t>
-      </w:r>
-      <w:proofErr w:type="gramStart"/>
-      <w:r>
-        <w:rPr>
-          <w:b/>
-          <w:sz w:val="18"/>
-          <w:szCs w:val="18"/>
-        </w:rPr>
-        <w:t>30</w:t>
-      </w:r>
-      <w:r>
-        <w:rPr>
-          <w:sz w:val="18"/>
-          <w:szCs w:val="18"/>
-        </w:rPr>
-        <w:t xml:space="preserve">  </w:t>
-      </w:r>
-      <w:proofErr w:type="spellStart"/>
+        <w:t>1.</w:t>
+      </w:r>
+      <w:r>
+        <w:rPr>
+          <w:sz w:val="18"/>
+          <w:szCs w:val="18"/>
+        </w:rPr>
+        <w:t>6</w:t>
+      </w:r>
+      <w:r>
+        <w:rPr>
+          <w:sz w:val="18"/>
+          <w:szCs w:val="18"/>
+        </w:rPr>
+        <w:t xml:space="preserve"> </w:t>
+      </w:r>
+      <w:r>
+        <w:rPr>
+          <w:sz w:val="18"/>
+          <w:szCs w:val="18"/>
+        </w:rPr>
+        <w:t>Арендная плата:</w:t>
+      </w:r>
+      <w:r>
+        <w:rPr>
+          <w:sz w:val="18"/>
+          <w:szCs w:val="18"/>
+        </w:rPr>
+        <w:t xml:space="preserve"> </w:t>
+      </w:r>
+      <w:r>
+        <w:rPr>
+          <w:b/>
+          <w:sz w:val="18"/>
+          <w:szCs w:val="18"/>
+        </w:rPr>
+        <w:t>3</w:t>
+      </w:r>
+      <w:r>
+        <w:rPr>
+          <w:b/>
+          <w:sz w:val="18"/>
+          <w:szCs w:val="18"/>
+        </w:rPr>
+        <w:t>1</w:t>
+      </w:r>
+      <w:r>
+        <w:rPr>
+          <w:sz w:val="18"/>
+          <w:szCs w:val="18"/>
+        </w:rPr>
+        <w:t xml:space="preserve"> </w:t>
+      </w:r>
+      <w:r>
+        <w:rPr>
+          <w:sz w:val="18"/>
+          <w:szCs w:val="18"/>
+        </w:rPr>
+        <w:t xml:space="preserve"> </w:t>
+      </w:r>
       <w:r>
         <w:rPr>
           <w:b/>
@@ -1136,8 +1242,6 @@
         </w:rPr>
         <w:t>дн</w:t>
       </w:r>
-      <w:proofErr w:type="spellEnd"/>
-      <w:proofErr w:type="gramEnd"/>
       <w:r>
         <w:rPr>
           <w:b/>
@@ -1152,7 +1256,31 @@
           <w:sz w:val="18"/>
           <w:szCs w:val="18"/>
         </w:rPr>
-        <w:t xml:space="preserve">00,00 руб. </w:t>
+        <w:t xml:space="preserve">00,00 </w:t>
+      </w:r>
+      <w:r>
+        <w:rPr>
+          <w:b/>
+          <w:sz w:val="18"/>
+          <w:szCs w:val="18"/>
+        </w:rPr>
+        <w:t>руб</w:t>
+      </w:r>
+      <w:r>
+        <w:rPr>
+          <w:b/>
+          <w:sz w:val="18"/>
+          <w:szCs w:val="18"/>
+        </w:rPr>
+        <w:t>.</w:t>
+      </w:r>
+      <w:r>
+        <w:rPr>
+          <w:b/>
+          <w:sz w:val="18"/>
+          <w:szCs w:val="18"/>
+        </w:rPr>
+        <w:t xml:space="preserve"> </w:t>
       </w:r>
       <w:r>
         <w:rPr>
@@ -1168,7 +1296,23 @@
           <w:sz w:val="18"/>
           <w:szCs w:val="18"/>
         </w:rPr>
-        <w:t xml:space="preserve">96 </w:t>
+        <w:t>99</w:t>
+      </w:r>
+      <w:r>
+        <w:rPr>
+          <w:b/>
+          <w:sz w:val="18"/>
+          <w:szCs w:val="18"/>
+        </w:rPr>
+        <w:t xml:space="preserve"> </w:t>
+      </w:r>
+      <w:r>
+        <w:rPr>
+          <w:b/>
+          <w:sz w:val="18"/>
+          <w:szCs w:val="18"/>
+        </w:rPr>
+        <w:t>2</w:t>
       </w:r>
       <w:r>
         <w:rPr>
@@ -1184,14 +1328,6 @@
           <w:sz w:val="18"/>
           <w:szCs w:val="18"/>
         </w:rPr>
-        <w:t>0</w:t>
-      </w:r>
-      <w:r>
-        <w:rPr>
-          <w:b/>
-          <w:sz w:val="18"/>
-          <w:szCs w:val="18"/>
-        </w:rPr>
         <w:t>0,00 (</w:t>
       </w:r>
       <w:r>
@@ -1200,7 +1336,23 @@
           <w:sz w:val="18"/>
           <w:szCs w:val="18"/>
         </w:rPr>
-        <w:t>Девяносто шесть тысяч</w:t>
+        <w:t>Девяносто девять</w:t>
+      </w:r>
+      <w:r>
+        <w:rPr>
+          <w:b/>
+          <w:sz w:val="18"/>
+          <w:szCs w:val="18"/>
+        </w:rPr>
+        <w:t xml:space="preserve"> тысяч</w:t>
+      </w:r>
+      <w:r>
+        <w:rPr>
+          <w:b/>
+          <w:sz w:val="18"/>
+          <w:szCs w:val="18"/>
+        </w:rPr>
+        <w:t xml:space="preserve"> двести</w:t>
       </w:r>
       <w:r>
         <w:rPr>
@@ -1277,15 +1429,23 @@
           <w:sz w:val="18"/>
           <w:szCs w:val="18"/>
         </w:rPr>
-        <w:t>: 09:00 «01» сентября 2026 - 20:00 «30</w:t>
-      </w:r>
-      <w:r>
-        <w:rPr>
-          <w:b/>
-          <w:sz w:val="18"/>
-          <w:szCs w:val="18"/>
-        </w:rPr>
-        <w:t>» сентября 2026</w:t>
+        <w:t xml:space="preserve">: 09:00 «01» </w:t>
+      </w:r>
+      <w:r>
+        <w:rPr>
+          <w:b/>
+          <w:sz w:val="18"/>
+          <w:szCs w:val="18"/>
+        </w:rPr>
+        <w:t>октября 2026 - 20:00 «31» октября</w:t>
+      </w:r>
+      <w:r>
+        <w:rPr>
+          <w:b/>
+          <w:sz w:val="18"/>
+          <w:szCs w:val="18"/>
+        </w:rPr>
+        <w:t xml:space="preserve"> 2026</w:t>
       </w:r>
     </w:p>
     <w:p>
@@ -1299,21 +1459,40 @@
           <w:szCs w:val="18"/>
         </w:rPr>
       </w:pPr>
-      <w:proofErr w:type="gramStart"/>
-      <w:r>
-        <w:rPr>
-          <w:sz w:val="18"/>
-          <w:szCs w:val="18"/>
-        </w:rPr>
-        <w:t>1.7  Допущенные</w:t>
-      </w:r>
-      <w:proofErr w:type="gramEnd"/>
-      <w:r>
-        <w:rPr>
-          <w:sz w:val="18"/>
-          <w:szCs w:val="18"/>
-        </w:rPr>
-        <w:t xml:space="preserve"> водители к управлению:</w:t>
+      <w:r>
+        <w:rPr>
+          <w:sz w:val="18"/>
+          <w:szCs w:val="18"/>
+        </w:rPr>
+        <w:t>1.7</w:t>
+      </w:r>
+      <w:r>
+        <w:rPr>
+          <w:sz w:val="18"/>
+          <w:szCs w:val="18"/>
+        </w:rPr>
+        <w:t xml:space="preserve"> </w:t>
+      </w:r>
+      <w:r>
+        <w:rPr>
+          <w:sz w:val="18"/>
+          <w:szCs w:val="18"/>
+        </w:rPr>
+        <w:t xml:space="preserve"> </w:t>
+      </w:r>
+      <w:r>
+        <w:rPr>
+          <w:sz w:val="18"/>
+          <w:szCs w:val="18"/>
+        </w:rPr>
+        <w:t>Допущенные вод</w:t>
+      </w:r>
+      <w:r>
+        <w:rPr>
+          <w:sz w:val="18"/>
+          <w:szCs w:val="18"/>
+        </w:rPr>
+        <w:t>ители к управлению:</w:t>
       </w:r>
     </w:p>
     <w:p>
@@ -1340,11 +1519,11 @@
           <w:insideH w:val="single" w:sz="4" w:space="0" w:color="auto"/>
           <w:insideV w:val="single" w:sz="4" w:space="0" w:color="auto"/>
         </w:tblBorders>
-        <w:tblLook w:val="04A0" w:firstRow="1" w:lastRow="0" w:firstColumn="1" w:lastColumn="0" w:noHBand="0" w:noVBand="1"/>
+        <w:tblLook w:val="04A0"/>
       </w:tblPr>
       <w:tblGrid>
-        <w:gridCol w:w="4865"/>
-        <w:gridCol w:w="5483"/>
+        <w:gridCol w:w="4980"/>
+        <w:gridCol w:w="5594"/>
       </w:tblGrid>
       <w:tr>
         <w:tc>
@@ -1489,7 +1668,6 @@
           <w:szCs w:val="18"/>
         </w:rPr>
       </w:pPr>
-      <w:proofErr w:type="gramStart"/>
       <w:r>
         <w:rPr>
           <w:sz w:val="18"/>
@@ -1510,16 +1688,7 @@
           <w:sz w:val="18"/>
           <w:szCs w:val="18"/>
         </w:rPr>
-        <w:t>Адрес</w:t>
-      </w:r>
-      <w:proofErr w:type="gramEnd"/>
-      <w:r>
-        <w:rPr>
-          <w:b/>
-          <w:sz w:val="18"/>
-          <w:szCs w:val="18"/>
-        </w:rPr>
-        <w:t xml:space="preserve"> подачи автомобиля</w:t>
+        <w:t>Адрес подачи автомобиля</w:t>
       </w:r>
       <w:r>
         <w:rPr>
@@ -1591,7 +1760,23 @@
           <w:sz w:val="18"/>
           <w:szCs w:val="18"/>
         </w:rPr>
-        <w:t xml:space="preserve">1,00 </w:t>
+        <w:t>0</w:t>
+      </w:r>
+      <w:r>
+        <w:rPr>
+          <w:b/>
+          <w:sz w:val="18"/>
+          <w:szCs w:val="18"/>
+        </w:rPr>
+        <w:t>,00</w:t>
+      </w:r>
+      <w:r>
+        <w:rPr>
+          <w:b/>
+          <w:sz w:val="18"/>
+          <w:szCs w:val="18"/>
+        </w:rPr>
+        <w:t xml:space="preserve"> </w:t>
       </w:r>
       <w:r>
         <w:rPr>
@@ -1640,7 +1825,15 @@
           <w:sz w:val="18"/>
           <w:szCs w:val="18"/>
         </w:rPr>
-        <w:t>6,00</w:t>
+        <w:t>10</w:t>
+      </w:r>
+      <w:r>
+        <w:rPr>
+          <w:b/>
+          <w:sz w:val="18"/>
+          <w:szCs w:val="18"/>
+        </w:rPr>
+        <w:t>,00</w:t>
       </w:r>
       <w:r>
         <w:rPr>
@@ -1655,7 +1848,14 @@
           <w:sz w:val="18"/>
           <w:szCs w:val="18"/>
         </w:rPr>
-        <w:t xml:space="preserve">рублей, за 1 км </w:t>
+        <w:t>рублей</w:t>
+      </w:r>
+      <w:r>
+        <w:rPr>
+          <w:sz w:val="18"/>
+          <w:szCs w:val="18"/>
+        </w:rPr>
+        <w:t xml:space="preserve">, за 1 км </w:t>
       </w:r>
     </w:p>
     <w:p>
@@ -1716,7 +1916,14 @@
           <w:sz w:val="18"/>
           <w:szCs w:val="18"/>
         </w:rPr>
-        <w:t xml:space="preserve">   </w:t>
+        <w:t xml:space="preserve"> </w:t>
+      </w:r>
+      <w:r>
+        <w:rPr>
+          <w:sz w:val="18"/>
+          <w:szCs w:val="18"/>
+        </w:rPr>
+        <w:t xml:space="preserve">  </w:t>
       </w:r>
     </w:p>
     <w:tbl>
@@ -1731,11 +1938,11 @@
           <w:insideH w:val="single" w:sz="4" w:space="0" w:color="auto"/>
           <w:insideV w:val="single" w:sz="4" w:space="0" w:color="auto"/>
         </w:tblBorders>
-        <w:tblLook w:val="04A0" w:firstRow="1" w:lastRow="0" w:firstColumn="1" w:lastColumn="0" w:noHBand="0" w:noVBand="1"/>
+        <w:tblLook w:val="04A0"/>
       </w:tblPr>
       <w:tblGrid>
-        <w:gridCol w:w="4893"/>
-        <w:gridCol w:w="5455"/>
+        <w:gridCol w:w="4993"/>
+        <w:gridCol w:w="5581"/>
       </w:tblGrid>
       <w:tr>
         <w:tc>
@@ -1767,7 +1974,15 @@
                 <w:sz w:val="18"/>
                 <w:szCs w:val="18"/>
               </w:rPr>
-              <w:t xml:space="preserve">Наименование </w:t>
+              <w:t>Наименование</w:t>
+            </w:r>
+            <w:r>
+              <w:rPr>
+                <w:b/>
+                <w:sz w:val="18"/>
+                <w:szCs w:val="18"/>
+              </w:rPr>
+              <w:t xml:space="preserve"> </w:t>
             </w:r>
           </w:p>
         </w:tc>
@@ -1828,34 +2043,14 @@
                 <w:szCs w:val="18"/>
               </w:rPr>
             </w:pPr>
-            <w:proofErr w:type="spellStart"/>
             <w:r>
               <w:rPr>
                 <w:sz w:val="18"/>
                 <w:szCs w:val="18"/>
                 <w:lang w:val="en-US"/>
               </w:rPr>
-              <w:t>Мойка</w:t>
-            </w:r>
-            <w:proofErr w:type="spellEnd"/>
-            <w:r>
-              <w:rPr>
-                <w:sz w:val="18"/>
-                <w:szCs w:val="18"/>
-                <w:lang w:val="en-US"/>
-              </w:rPr>
-              <w:t xml:space="preserve"> </w:t>
-            </w:r>
-            <w:proofErr w:type="spellStart"/>
-            <w:r>
-              <w:rPr>
-                <w:sz w:val="18"/>
-                <w:szCs w:val="18"/>
-                <w:lang w:val="en-US"/>
-              </w:rPr>
-              <w:t>Седан</w:t>
-            </w:r>
-            <w:proofErr w:type="spellEnd"/>
+              <w:t>Мойка Седан</w:t>
+            </w:r>
           </w:p>
         </w:tc>
         <w:tc>
@@ -1916,7 +2111,28 @@
           <w:sz w:val="18"/>
           <w:szCs w:val="18"/>
         </w:rPr>
-        <w:t>*мойка автомобиля до 2000 рублей (в зависимости от класса автомобиля)</w:t>
+        <w:t>*мойка автомобиля до 20</w:t>
+      </w:r>
+      <w:r>
+        <w:rPr>
+          <w:sz w:val="18"/>
+          <w:szCs w:val="18"/>
+        </w:rPr>
+        <w:t>00 рубл</w:t>
+      </w:r>
+      <w:r>
+        <w:rPr>
+          <w:sz w:val="18"/>
+          <w:szCs w:val="18"/>
+        </w:rPr>
+        <w:t>ей (в зависимости от класса автомобиля</w:t>
+      </w:r>
+      <w:r>
+        <w:rPr>
+          <w:sz w:val="18"/>
+          <w:szCs w:val="18"/>
+        </w:rPr>
+        <w:t>)</w:t>
       </w:r>
     </w:p>
     <w:p>
@@ -2352,7 +2568,21 @@
           <w:sz w:val="18"/>
           <w:szCs w:val="18"/>
         </w:rPr>
-        <w:t>обо всех неисправностях ТС.</w:t>
+        <w:t>о</w:t>
+      </w:r>
+      <w:r>
+        <w:rPr>
+          <w:sz w:val="18"/>
+          <w:szCs w:val="18"/>
+        </w:rPr>
+        <w:t>бо</w:t>
+      </w:r>
+      <w:r>
+        <w:rPr>
+          <w:sz w:val="18"/>
+          <w:szCs w:val="18"/>
+        </w:rPr>
+        <w:t xml:space="preserve"> всех неисправностях ТС.</w:t>
       </w:r>
     </w:p>
     <w:p>
@@ -2472,7 +2702,28 @@
           <w:sz w:val="18"/>
           <w:szCs w:val="18"/>
         </w:rPr>
-        <w:t>в размере 15000 рублей за утерю свидетельства регистрации ТС, ключа замка зажигания – стоимость восстановления оригинала, брелок сигнализации – стоимость восстановления оригинала.</w:t>
+        <w:t>в раз</w:t>
+      </w:r>
+      <w:r>
+        <w:rPr>
+          <w:sz w:val="18"/>
+          <w:szCs w:val="18"/>
+        </w:rPr>
+        <w:t>мере 15</w:t>
+      </w:r>
+      <w:r>
+        <w:rPr>
+          <w:sz w:val="18"/>
+          <w:szCs w:val="18"/>
+        </w:rPr>
+        <w:t>000 рублей за утерю свидетельства регистрации ТС,</w:t>
+      </w:r>
+      <w:r>
+        <w:rPr>
+          <w:sz w:val="18"/>
+          <w:szCs w:val="18"/>
+        </w:rPr>
+        <w:t xml:space="preserve"> ключа замка зажигания – стоимость восстановления оригинала, брелок сигнализации – стоимость восстановления оригинала.</w:t>
       </w:r>
     </w:p>
     <w:p>
@@ -2491,6 +2742,7 @@
           <w:sz w:val="18"/>
           <w:szCs w:val="18"/>
         </w:rPr>
+        <w:lastRenderedPageBreak/>
         <w:t>2.2.6</w:t>
       </w:r>
       <w:r>
@@ -2547,7 +2799,6 @@
           <w:sz w:val="18"/>
           <w:szCs w:val="18"/>
         </w:rPr>
-        <w:lastRenderedPageBreak/>
         <w:t>2.2.7</w:t>
       </w:r>
       <w:r>
@@ -3089,16 +3340,7 @@
           <w:sz w:val="18"/>
           <w:szCs w:val="18"/>
         </w:rPr>
-        <w:t xml:space="preserve"> о возникших обстоятельствах несвоевременн</w:t>
-      </w:r>
-      <w:bookmarkStart w:id="0" w:name="_GoBack"/>
-      <w:bookmarkEnd w:id="0"/>
-      <w:r>
-        <w:rPr>
-          <w:sz w:val="18"/>
-          <w:szCs w:val="18"/>
-        </w:rPr>
-        <w:t xml:space="preserve">ого возврата транспортного средства в установленное место и сроки по истечении 3 часов может расцениваться сторонами как умышленное хищение, и </w:t>
+        <w:t xml:space="preserve"> о возникших обстоятельствах несвоевременного возврата транспортного средства в установленное место и сроки по истечении 3 часов может расцениваться сторонами как умышленное хищение, и </w:t>
       </w:r>
       <w:r>
         <w:rPr>
@@ -3275,7 +3517,34 @@
           <w:szCs w:val="18"/>
           <w:u w:val="single"/>
         </w:rPr>
-        <w:t xml:space="preserve">130 </w:t>
+        <w:t>1</w:t>
+      </w:r>
+      <w:r>
+        <w:rPr>
+          <w:b/>
+          <w:sz w:val="18"/>
+          <w:szCs w:val="18"/>
+          <w:u w:val="single"/>
+        </w:rPr>
+        <w:t>3</w:t>
+      </w:r>
+      <w:r>
+        <w:rPr>
+          <w:b/>
+          <w:sz w:val="18"/>
+          <w:szCs w:val="18"/>
+          <w:u w:val="single"/>
+        </w:rPr>
+        <w:t>0</w:t>
+      </w:r>
+      <w:r>
+        <w:rPr>
+          <w:b/>
+          <w:sz w:val="18"/>
+          <w:szCs w:val="18"/>
+          <w:u w:val="single"/>
+        </w:rPr>
+        <w:t xml:space="preserve"> </w:t>
       </w:r>
       <w:r>
         <w:rPr>
@@ -3633,23 +3902,7 @@
           <w:sz w:val="18"/>
           <w:szCs w:val="18"/>
         </w:rPr>
-        <w:t>3.</w:t>
-      </w:r>
-      <w:proofErr w:type="gramStart"/>
-      <w:r>
-        <w:rPr>
-          <w:sz w:val="18"/>
-          <w:szCs w:val="18"/>
-        </w:rPr>
-        <w:t>4.За</w:t>
-      </w:r>
-      <w:proofErr w:type="gramEnd"/>
-      <w:r>
-        <w:rPr>
-          <w:sz w:val="18"/>
-          <w:szCs w:val="18"/>
-        </w:rPr>
-        <w:t xml:space="preserve"> превышение сроков возврата транспортного средства более </w:t>
+        <w:t xml:space="preserve">3.4.За превышение сроков возврата транспортного средства более </w:t>
       </w:r>
       <w:r>
         <w:rPr>
@@ -3824,7 +4077,6 @@
         </w:rPr>
         <w:t xml:space="preserve"> оплачиваются </w:t>
       </w:r>
-      <w:proofErr w:type="gramStart"/>
       <w:r>
         <w:rPr>
           <w:b/>
@@ -3854,9 +4106,479 @@
           <w:sz w:val="18"/>
           <w:szCs w:val="18"/>
         </w:rPr>
+        <w:t xml:space="preserve">Арендатор </w:t>
+      </w:r>
+      <w:r>
+        <w:rPr>
+          <w:sz w:val="18"/>
+          <w:szCs w:val="18"/>
+        </w:rPr>
+        <w:t xml:space="preserve">обязуется выплатить недостающую сумму </w:t>
+      </w:r>
+      <w:r>
+        <w:rPr>
+          <w:b/>
+          <w:sz w:val="18"/>
+          <w:szCs w:val="18"/>
+        </w:rPr>
+        <w:t>Арендодателю</w:t>
+      </w:r>
+      <w:r>
+        <w:rPr>
+          <w:sz w:val="18"/>
+          <w:szCs w:val="18"/>
+        </w:rPr>
+        <w:t xml:space="preserve"> в течение</w:t>
+      </w:r>
+      <w:r>
+        <w:rPr>
+          <w:sz w:val="18"/>
+          <w:szCs w:val="18"/>
+        </w:rPr>
+        <w:t xml:space="preserve"> 3</w:t>
+      </w:r>
+      <w:r>
+        <w:rPr>
+          <w:sz w:val="18"/>
+          <w:szCs w:val="18"/>
+        </w:rPr>
+        <w:t>-</w:t>
+      </w:r>
+      <w:r>
+        <w:rPr>
+          <w:sz w:val="18"/>
+          <w:szCs w:val="18"/>
+        </w:rPr>
+        <w:t>х дней с момента уведомления о сложившейся ситуации.</w:t>
+      </w:r>
+    </w:p>
+    <w:p>
+      <w:pPr>
+        <w:tabs>
+          <w:tab w:val="left" w:pos="180"/>
+        </w:tabs>
+        <w:jc w:val="center"/>
+        <w:rPr>
+          <w:b/>
+          <w:sz w:val="18"/>
+          <w:szCs w:val="18"/>
+        </w:rPr>
+      </w:pPr>
+    </w:p>
+    <w:p>
+      <w:pPr>
+        <w:tabs>
+          <w:tab w:val="left" w:pos="180"/>
+        </w:tabs>
+        <w:jc w:val="center"/>
+        <w:rPr>
+          <w:b/>
+          <w:sz w:val="18"/>
+          <w:szCs w:val="18"/>
+        </w:rPr>
+      </w:pPr>
+      <w:r>
+        <w:rPr>
+          <w:b/>
+          <w:sz w:val="18"/>
+          <w:szCs w:val="18"/>
+        </w:rPr>
+        <w:t>4. ОТВЕТСТВЕННОСТЬ СТОРОН</w:t>
+      </w:r>
+    </w:p>
+    <w:p>
+      <w:pPr>
+        <w:tabs>
+          <w:tab w:val="left" w:pos="180"/>
+        </w:tabs>
+        <w:jc w:val="both"/>
+        <w:rPr>
+          <w:sz w:val="18"/>
+          <w:szCs w:val="18"/>
+        </w:rPr>
+      </w:pPr>
+    </w:p>
+    <w:p>
+      <w:pPr>
+        <w:tabs>
+          <w:tab w:val="left" w:pos="180"/>
+        </w:tabs>
+        <w:jc w:val="both"/>
+        <w:rPr>
+          <w:sz w:val="18"/>
+          <w:szCs w:val="18"/>
+        </w:rPr>
+      </w:pPr>
+      <w:r>
+        <w:rPr>
+          <w:sz w:val="18"/>
+          <w:szCs w:val="18"/>
+        </w:rPr>
+        <w:t>4.1. Стороны несут имущественную ответственность за неисполнение или ненадлежащее исполнение условий Договора в соответствии с нормами действующего законодательства и условиями настоящего Договора.</w:t>
+      </w:r>
+    </w:p>
+    <w:p>
+      <w:pPr>
+        <w:tabs>
+          <w:tab w:val="left" w:pos="180"/>
+        </w:tabs>
+        <w:jc w:val="both"/>
+        <w:rPr>
+          <w:sz w:val="18"/>
+          <w:szCs w:val="18"/>
+        </w:rPr>
+      </w:pPr>
+      <w:r>
+        <w:rPr>
+          <w:sz w:val="18"/>
+          <w:szCs w:val="18"/>
+        </w:rPr>
+        <w:t>4.2. За допущенные нарушения п. 2.2.5</w:t>
+      </w:r>
+      <w:r>
+        <w:rPr>
+          <w:sz w:val="18"/>
+          <w:szCs w:val="18"/>
+        </w:rPr>
+        <w:t>-2.2.8</w:t>
+      </w:r>
+      <w:r>
+        <w:rPr>
+          <w:sz w:val="18"/>
+          <w:szCs w:val="18"/>
+        </w:rPr>
+        <w:t xml:space="preserve">. настоящего Договора </w:t>
+      </w:r>
+      <w:r>
+        <w:rPr>
+          <w:b/>
+          <w:sz w:val="18"/>
+          <w:szCs w:val="18"/>
+        </w:rPr>
         <w:t>Арендатор</w:t>
       </w:r>
-      <w:proofErr w:type="gramEnd"/>
+      <w:r>
+        <w:rPr>
+          <w:sz w:val="18"/>
+          <w:szCs w:val="18"/>
+        </w:rPr>
+        <w:t xml:space="preserve"> уплачивает </w:t>
+      </w:r>
+      <w:r>
+        <w:rPr>
+          <w:b/>
+          <w:sz w:val="18"/>
+          <w:szCs w:val="18"/>
+        </w:rPr>
+        <w:t>Арендодателю</w:t>
+      </w:r>
+      <w:r>
+        <w:rPr>
+          <w:sz w:val="18"/>
+          <w:szCs w:val="18"/>
+        </w:rPr>
+        <w:t xml:space="preserve"> штраф в размер 50 000 (Пятьдесят</w:t>
+      </w:r>
+      <w:r>
+        <w:rPr>
+          <w:sz w:val="18"/>
+          <w:szCs w:val="18"/>
+        </w:rPr>
+        <w:t xml:space="preserve"> тысяч) рублей.</w:t>
+      </w:r>
+    </w:p>
+    <w:p>
+      <w:pPr>
+        <w:tabs>
+          <w:tab w:val="left" w:pos="180"/>
+        </w:tabs>
+        <w:jc w:val="both"/>
+        <w:rPr>
+          <w:sz w:val="18"/>
+          <w:szCs w:val="18"/>
+        </w:rPr>
+      </w:pPr>
+      <w:r>
+        <w:rPr>
+          <w:sz w:val="18"/>
+          <w:szCs w:val="18"/>
+        </w:rPr>
+        <w:t xml:space="preserve">4.3. В случае гибели или повреждения транспортного средства </w:t>
+      </w:r>
+      <w:r>
+        <w:rPr>
+          <w:b/>
+          <w:sz w:val="18"/>
+          <w:szCs w:val="18"/>
+        </w:rPr>
+        <w:t>Арендатор</w:t>
+      </w:r>
+      <w:r>
+        <w:rPr>
+          <w:sz w:val="18"/>
+          <w:szCs w:val="18"/>
+        </w:rPr>
+        <w:t xml:space="preserve"> обязан возместить </w:t>
+      </w:r>
+      <w:r>
+        <w:rPr>
+          <w:b/>
+          <w:sz w:val="18"/>
+          <w:szCs w:val="18"/>
+        </w:rPr>
+        <w:t>Арендодателю</w:t>
+      </w:r>
+      <w:r>
+        <w:rPr>
+          <w:sz w:val="18"/>
+          <w:szCs w:val="18"/>
+        </w:rPr>
+        <w:t xml:space="preserve"> причиненный ущерб, если не докажет, что гибель или повреждение транспортного средства произошли по обстоятельствам, за которые </w:t>
+      </w:r>
+      <w:r>
+        <w:rPr>
+          <w:b/>
+          <w:sz w:val="18"/>
+          <w:szCs w:val="18"/>
+        </w:rPr>
+        <w:t>Арендатор</w:t>
+      </w:r>
+      <w:r>
+        <w:rPr>
+          <w:sz w:val="18"/>
+          <w:szCs w:val="18"/>
+        </w:rPr>
+        <w:t xml:space="preserve"> не отвечает в соответствии с законом или условиями настоящего Договора.</w:t>
+      </w:r>
+    </w:p>
+    <w:p>
+      <w:pPr>
+        <w:tabs>
+          <w:tab w:val="left" w:pos="180"/>
+        </w:tabs>
+        <w:jc w:val="both"/>
+        <w:rPr>
+          <w:sz w:val="18"/>
+          <w:szCs w:val="18"/>
+        </w:rPr>
+      </w:pPr>
+      <w:r>
+        <w:rPr>
+          <w:sz w:val="18"/>
+          <w:szCs w:val="18"/>
+        </w:rPr>
+        <w:t xml:space="preserve">4.4. </w:t>
+      </w:r>
+      <w:r>
+        <w:rPr>
+          <w:b/>
+          <w:sz w:val="18"/>
+          <w:szCs w:val="18"/>
+        </w:rPr>
+        <w:t>Арендатор</w:t>
+      </w:r>
+      <w:r>
+        <w:rPr>
+          <w:sz w:val="18"/>
+          <w:szCs w:val="18"/>
+        </w:rPr>
+        <w:t xml:space="preserve"> обязан за свой счет возместить ущерб, причиненный третьим лицам транспортным средством, его механизмами, устройствами и оборудованием.</w:t>
+      </w:r>
+    </w:p>
+    <w:p>
+      <w:pPr>
+        <w:tabs>
+          <w:tab w:val="left" w:pos="180"/>
+        </w:tabs>
+        <w:jc w:val="both"/>
+        <w:rPr>
+          <w:sz w:val="18"/>
+          <w:szCs w:val="18"/>
+        </w:rPr>
+      </w:pPr>
+      <w:r>
+        <w:rPr>
+          <w:sz w:val="18"/>
+          <w:szCs w:val="18"/>
+        </w:rPr>
+        <w:t xml:space="preserve">4.5. </w:t>
+      </w:r>
+      <w:r>
+        <w:rPr>
+          <w:sz w:val="18"/>
+          <w:szCs w:val="18"/>
+        </w:rPr>
+        <w:t xml:space="preserve">При изъятии транспортного средства в соответствии с п. 2.1.4. настоящего Договора </w:t>
+      </w:r>
+      <w:r>
+        <w:rPr>
+          <w:b/>
+          <w:sz w:val="18"/>
+          <w:szCs w:val="18"/>
+        </w:rPr>
+        <w:t>Арендодатель</w:t>
+      </w:r>
+      <w:r>
+        <w:rPr>
+          <w:sz w:val="18"/>
+          <w:szCs w:val="18"/>
+        </w:rPr>
+        <w:t xml:space="preserve"> не несет ответственности за пропажу или ущерб имущества </w:t>
+      </w:r>
+      <w:r>
+        <w:rPr>
+          <w:b/>
+          <w:sz w:val="18"/>
+          <w:szCs w:val="18"/>
+        </w:rPr>
+        <w:t>Арендатора</w:t>
+      </w:r>
+      <w:r>
+        <w:rPr>
+          <w:sz w:val="18"/>
+          <w:szCs w:val="18"/>
+        </w:rPr>
+        <w:t>, находящего в транспортном средстве на момент изъятия.</w:t>
+      </w:r>
+    </w:p>
+    <w:p>
+      <w:pPr>
+        <w:tabs>
+          <w:tab w:val="left" w:pos="180"/>
+        </w:tabs>
+        <w:jc w:val="both"/>
+        <w:rPr>
+          <w:color w:val="FF0000"/>
+          <w:sz w:val="18"/>
+          <w:szCs w:val="18"/>
+        </w:rPr>
+      </w:pPr>
+      <w:r>
+        <w:rPr>
+          <w:sz w:val="18"/>
+          <w:szCs w:val="18"/>
+        </w:rPr>
+        <w:t>4.6. При выполнении требований пунктов 2.</w:t>
+      </w:r>
+      <w:r>
+        <w:rPr>
+          <w:sz w:val="18"/>
+          <w:szCs w:val="18"/>
+        </w:rPr>
+        <w:t>2.5 и 2.2.11</w:t>
+      </w:r>
+      <w:r>
+        <w:rPr>
+          <w:sz w:val="18"/>
+          <w:szCs w:val="18"/>
+        </w:rPr>
+        <w:t xml:space="preserve"> настоящего договора после ДТП Арендодатель выполняет ремонт автомобиля за счет страхового покрытия при условии оплаты арендатором </w:t>
+      </w:r>
+      <w:r>
+        <w:rPr>
+          <w:color w:val="FF0000"/>
+          <w:sz w:val="18"/>
+          <w:szCs w:val="18"/>
+        </w:rPr>
+        <w:t xml:space="preserve">безусловной франшизы в размере </w:t>
+      </w:r>
+      <w:r>
+        <w:rPr>
+          <w:color w:val="FF0000"/>
+          <w:sz w:val="18"/>
+          <w:szCs w:val="18"/>
+        </w:rPr>
+        <w:t>50 000</w:t>
+      </w:r>
+      <w:r>
+        <w:rPr>
+          <w:color w:val="FF0000"/>
+          <w:sz w:val="18"/>
+          <w:szCs w:val="18"/>
+        </w:rPr>
+        <w:t xml:space="preserve"> (</w:t>
+      </w:r>
+      <w:r>
+        <w:rPr>
+          <w:color w:val="FF0000"/>
+          <w:sz w:val="18"/>
+          <w:szCs w:val="18"/>
+        </w:rPr>
+        <w:t>Пятьдесят тысяч</w:t>
+      </w:r>
+      <w:r>
+        <w:rPr>
+          <w:color w:val="FF0000"/>
+          <w:sz w:val="18"/>
+          <w:szCs w:val="18"/>
+        </w:rPr>
+        <w:t>)</w:t>
+      </w:r>
+      <w:r>
+        <w:rPr>
+          <w:color w:val="FF0000"/>
+          <w:sz w:val="18"/>
+          <w:szCs w:val="18"/>
+        </w:rPr>
+        <w:t xml:space="preserve"> рублей</w:t>
+      </w:r>
+    </w:p>
+    <w:p>
+      <w:pPr>
+        <w:tabs>
+          <w:tab w:val="left" w:pos="180"/>
+        </w:tabs>
+        <w:jc w:val="both"/>
+        <w:rPr>
+          <w:sz w:val="18"/>
+          <w:szCs w:val="18"/>
+        </w:rPr>
+      </w:pPr>
+      <w:r>
+        <w:rPr>
+          <w:sz w:val="18"/>
+          <w:szCs w:val="18"/>
+        </w:rPr>
+        <w:t xml:space="preserve">4.7. </w:t>
+      </w:r>
+      <w:r>
+        <w:rPr>
+          <w:b/>
+          <w:sz w:val="18"/>
+          <w:szCs w:val="18"/>
+        </w:rPr>
+        <w:t>Арендатор</w:t>
+      </w:r>
+      <w:r>
+        <w:rPr>
+          <w:sz w:val="18"/>
+          <w:szCs w:val="18"/>
+        </w:rPr>
+        <w:t xml:space="preserve"> несет ответственность по оплате всех штрафов, наложенных в процессе эксплуатации автомобиля, по средствам видео-фиксации нарушений ПДД. (такие нарушения как превышения скорости, проезд на красный сигнал светофора, нарушение дорожной разметки.) При этом оплата суммы штрафа </w:t>
+      </w:r>
+      <w:r>
+        <w:rPr>
+          <w:b/>
+          <w:sz w:val="18"/>
+          <w:szCs w:val="18"/>
+        </w:rPr>
+        <w:t>Арендатор</w:t>
+      </w:r>
+      <w:r>
+        <w:rPr>
+          <w:sz w:val="18"/>
+          <w:szCs w:val="18"/>
+        </w:rPr>
+        <w:t xml:space="preserve"> возмещает </w:t>
+      </w:r>
+      <w:r>
+        <w:rPr>
+          <w:b/>
+          <w:sz w:val="18"/>
+          <w:szCs w:val="18"/>
+        </w:rPr>
+        <w:t>Арендодателю</w:t>
+      </w:r>
       <w:r>
         <w:rPr>
           <w:b/>
@@ -3870,77 +4592,7 @@
           <w:sz w:val="18"/>
           <w:szCs w:val="18"/>
         </w:rPr>
-        <w:t xml:space="preserve">обязуется выплатить недостающую сумму </w:t>
-      </w:r>
-      <w:r>
-        <w:rPr>
-          <w:b/>
-          <w:sz w:val="18"/>
-          <w:szCs w:val="18"/>
-        </w:rPr>
-        <w:t>Арендодателю</w:t>
-      </w:r>
-      <w:r>
-        <w:rPr>
-          <w:sz w:val="18"/>
-          <w:szCs w:val="18"/>
-        </w:rPr>
-        <w:t xml:space="preserve"> в течение</w:t>
-      </w:r>
-      <w:r>
-        <w:rPr>
-          <w:sz w:val="18"/>
-          <w:szCs w:val="18"/>
-        </w:rPr>
-        <w:t xml:space="preserve"> 3</w:t>
-      </w:r>
-      <w:r>
-        <w:rPr>
-          <w:sz w:val="18"/>
-          <w:szCs w:val="18"/>
-        </w:rPr>
-        <w:t>-</w:t>
-      </w:r>
-      <w:r>
-        <w:rPr>
-          <w:sz w:val="18"/>
-          <w:szCs w:val="18"/>
-        </w:rPr>
-        <w:t>х дней с момента уведомления о сложившейся ситуации.</w:t>
-      </w:r>
-    </w:p>
-    <w:p>
-      <w:pPr>
-        <w:tabs>
-          <w:tab w:val="left" w:pos="180"/>
-        </w:tabs>
-        <w:jc w:val="center"/>
-        <w:rPr>
-          <w:b/>
-          <w:sz w:val="18"/>
-          <w:szCs w:val="18"/>
-        </w:rPr>
-      </w:pPr>
-    </w:p>
-    <w:p>
-      <w:pPr>
-        <w:tabs>
-          <w:tab w:val="left" w:pos="180"/>
-        </w:tabs>
-        <w:jc w:val="center"/>
-        <w:rPr>
-          <w:b/>
-          <w:sz w:val="18"/>
-          <w:szCs w:val="18"/>
-        </w:rPr>
-      </w:pPr>
-      <w:r>
-        <w:rPr>
-          <w:b/>
-          <w:sz w:val="18"/>
-          <w:szCs w:val="18"/>
-        </w:rPr>
-        <w:t>4. ОТВЕТСТВЕННОСТЬ СТОРОН</w:t>
+        <w:t>косвенные расходы по оплате данного штрафа в размере 20% от его суммы (налоги, обработка штрафов, перечисление штрафов в бюджет и пр.)</w:t>
       </w:r>
     </w:p>
     <w:p>
@@ -3954,6 +4606,46 @@
           <w:szCs w:val="18"/>
         </w:rPr>
       </w:pPr>
+      <w:r>
+        <w:rPr>
+          <w:sz w:val="18"/>
+          <w:szCs w:val="18"/>
+        </w:rPr>
+        <w:lastRenderedPageBreak/>
+        <w:t xml:space="preserve">4.8. </w:t>
+      </w:r>
+      <w:r>
+        <w:rPr>
+          <w:b/>
+          <w:sz w:val="18"/>
+          <w:szCs w:val="18"/>
+        </w:rPr>
+        <w:t>В</w:t>
+      </w:r>
+      <w:r>
+        <w:rPr>
+          <w:b/>
+          <w:sz w:val="18"/>
+          <w:szCs w:val="18"/>
+        </w:rPr>
+        <w:t xml:space="preserve"> случае превышения скоростного режима автомобиля более 90 км/час в городе и более 129</w:t>
+      </w:r>
+      <w:r>
+        <w:rPr>
+          <w:b/>
+          <w:sz w:val="18"/>
+          <w:szCs w:val="18"/>
+        </w:rPr>
+        <w:t xml:space="preserve"> км/час за городом, Арендатор оплачивает Арендодателю штраф в размере </w:t>
+      </w:r>
+      <w:r>
+        <w:rPr>
+          <w:b/>
+          <w:sz w:val="18"/>
+          <w:szCs w:val="18"/>
+        </w:rPr>
+        <w:t>5000 рублей.</w:t>
+      </w:r>
     </w:p>
     <w:p>
       <w:pPr>
@@ -3962,465 +4654,12 @@
         </w:tabs>
         <w:jc w:val="both"/>
         <w:rPr>
-          <w:sz w:val="18"/>
-          <w:szCs w:val="18"/>
-        </w:rPr>
-      </w:pPr>
-      <w:r>
-        <w:rPr>
-          <w:sz w:val="18"/>
-          <w:szCs w:val="18"/>
-        </w:rPr>
-        <w:t>4.1. Стороны несут имущественную ответственность за неисполнение или ненадлежащее исполнение условий Договора в соответствии с нормами действующего законодательства и условиями настоящего Договора.</w:t>
-      </w:r>
-    </w:p>
-    <w:p>
-      <w:pPr>
-        <w:tabs>
-          <w:tab w:val="left" w:pos="180"/>
-        </w:tabs>
-        <w:jc w:val="both"/>
-        <w:rPr>
-          <w:sz w:val="18"/>
-          <w:szCs w:val="18"/>
-        </w:rPr>
-      </w:pPr>
-      <w:r>
-        <w:rPr>
-          <w:sz w:val="18"/>
-          <w:szCs w:val="18"/>
-        </w:rPr>
-        <w:t>4.2. За допущенные нарушения п. 2.2.5</w:t>
-      </w:r>
-      <w:r>
-        <w:rPr>
-          <w:sz w:val="18"/>
-          <w:szCs w:val="18"/>
-        </w:rPr>
-        <w:t>-2.2.8</w:t>
-      </w:r>
-      <w:r>
-        <w:rPr>
-          <w:sz w:val="18"/>
-          <w:szCs w:val="18"/>
-        </w:rPr>
-        <w:t xml:space="preserve">. настоящего Договора </w:t>
-      </w:r>
-      <w:r>
-        <w:rPr>
-          <w:b/>
-          <w:sz w:val="18"/>
-          <w:szCs w:val="18"/>
-        </w:rPr>
-        <w:t>Арендатор</w:t>
-      </w:r>
-      <w:r>
-        <w:rPr>
-          <w:sz w:val="18"/>
-          <w:szCs w:val="18"/>
-        </w:rPr>
-        <w:t xml:space="preserve"> уплачивает </w:t>
-      </w:r>
-      <w:r>
-        <w:rPr>
-          <w:b/>
-          <w:sz w:val="18"/>
-          <w:szCs w:val="18"/>
-        </w:rPr>
-        <w:t>Арендодателю</w:t>
-      </w:r>
-      <w:r>
-        <w:rPr>
-          <w:sz w:val="18"/>
-          <w:szCs w:val="18"/>
-        </w:rPr>
-        <w:t xml:space="preserve"> штраф в размер 50 000 (Пятьдесят</w:t>
-      </w:r>
-      <w:r>
-        <w:rPr>
-          <w:sz w:val="18"/>
-          <w:szCs w:val="18"/>
-        </w:rPr>
-        <w:t xml:space="preserve"> тысяч) рублей.</w:t>
-      </w:r>
-    </w:p>
-    <w:p>
-      <w:pPr>
-        <w:tabs>
-          <w:tab w:val="left" w:pos="180"/>
-        </w:tabs>
-        <w:jc w:val="both"/>
-        <w:rPr>
-          <w:sz w:val="18"/>
-          <w:szCs w:val="18"/>
-        </w:rPr>
-      </w:pPr>
-      <w:r>
-        <w:rPr>
-          <w:sz w:val="18"/>
-          <w:szCs w:val="18"/>
-        </w:rPr>
-        <w:t xml:space="preserve">4.3. В случае гибели или повреждения транспортного средства </w:t>
-      </w:r>
-      <w:r>
-        <w:rPr>
-          <w:b/>
-          <w:sz w:val="18"/>
-          <w:szCs w:val="18"/>
-        </w:rPr>
-        <w:t>Арендатор</w:t>
-      </w:r>
-      <w:r>
-        <w:rPr>
-          <w:sz w:val="18"/>
-          <w:szCs w:val="18"/>
-        </w:rPr>
-        <w:t xml:space="preserve"> обязан возместить </w:t>
-      </w:r>
-      <w:r>
-        <w:rPr>
-          <w:b/>
-          <w:sz w:val="18"/>
-          <w:szCs w:val="18"/>
-        </w:rPr>
-        <w:t>Арендодателю</w:t>
-      </w:r>
-      <w:r>
-        <w:rPr>
-          <w:sz w:val="18"/>
-          <w:szCs w:val="18"/>
-        </w:rPr>
-        <w:t xml:space="preserve"> причиненный ущерб, если не докажет, что гибель или повреждение транспортного средства произошли по обстоятельствам, за которые </w:t>
-      </w:r>
-      <w:r>
-        <w:rPr>
-          <w:b/>
-          <w:sz w:val="18"/>
-          <w:szCs w:val="18"/>
-        </w:rPr>
-        <w:t>Арендатор</w:t>
-      </w:r>
-      <w:r>
-        <w:rPr>
-          <w:sz w:val="18"/>
-          <w:szCs w:val="18"/>
-        </w:rPr>
-        <w:t xml:space="preserve"> не отвечает в соответствии с законом или условиями настоящего Договора.</w:t>
-      </w:r>
-    </w:p>
-    <w:p>
-      <w:pPr>
-        <w:tabs>
-          <w:tab w:val="left" w:pos="180"/>
-        </w:tabs>
-        <w:jc w:val="both"/>
-        <w:rPr>
-          <w:sz w:val="18"/>
-          <w:szCs w:val="18"/>
-        </w:rPr>
-      </w:pPr>
-      <w:r>
-        <w:rPr>
-          <w:sz w:val="18"/>
-          <w:szCs w:val="18"/>
-        </w:rPr>
-        <w:t xml:space="preserve">4.4. </w:t>
-      </w:r>
-      <w:r>
-        <w:rPr>
-          <w:b/>
-          <w:sz w:val="18"/>
-          <w:szCs w:val="18"/>
-        </w:rPr>
-        <w:t>Арендатор</w:t>
-      </w:r>
-      <w:r>
-        <w:rPr>
-          <w:sz w:val="18"/>
-          <w:szCs w:val="18"/>
-        </w:rPr>
-        <w:t xml:space="preserve"> обязан за свой счет возместить ущерб, причиненный третьим лицам транспортным средством, его механизмами, устройствами и оборудованием.</w:t>
-      </w:r>
-    </w:p>
-    <w:p>
-      <w:pPr>
-        <w:tabs>
-          <w:tab w:val="left" w:pos="180"/>
-        </w:tabs>
-        <w:jc w:val="both"/>
-        <w:rPr>
-          <w:sz w:val="18"/>
-          <w:szCs w:val="18"/>
-        </w:rPr>
-      </w:pPr>
-      <w:r>
-        <w:rPr>
-          <w:sz w:val="18"/>
-          <w:szCs w:val="18"/>
-        </w:rPr>
-        <w:t xml:space="preserve">4.5. </w:t>
-      </w:r>
-      <w:r>
-        <w:rPr>
-          <w:sz w:val="18"/>
-          <w:szCs w:val="18"/>
-        </w:rPr>
-        <w:t xml:space="preserve">При изъятии транспортного средства в соответствии с п. 2.1.4. настоящего Договора </w:t>
-      </w:r>
-      <w:r>
-        <w:rPr>
-          <w:b/>
-          <w:sz w:val="18"/>
-          <w:szCs w:val="18"/>
-        </w:rPr>
-        <w:t>Арендодатель</w:t>
-      </w:r>
-      <w:r>
-        <w:rPr>
-          <w:sz w:val="18"/>
-          <w:szCs w:val="18"/>
-        </w:rPr>
-        <w:t xml:space="preserve"> не несет ответственности за пропажу или ущерб имущества </w:t>
-      </w:r>
-      <w:r>
-        <w:rPr>
-          <w:b/>
-          <w:sz w:val="18"/>
-          <w:szCs w:val="18"/>
-        </w:rPr>
-        <w:t>Арендатора</w:t>
-      </w:r>
-      <w:r>
-        <w:rPr>
-          <w:sz w:val="18"/>
-          <w:szCs w:val="18"/>
-        </w:rPr>
-        <w:t>, находящего в транспортном средстве на момент изъятия.</w:t>
-      </w:r>
-    </w:p>
-    <w:p>
-      <w:pPr>
-        <w:tabs>
-          <w:tab w:val="left" w:pos="180"/>
-        </w:tabs>
-        <w:jc w:val="both"/>
-        <w:rPr>
-          <w:color w:val="FF0000"/>
-          <w:sz w:val="18"/>
-          <w:szCs w:val="18"/>
-        </w:rPr>
-      </w:pPr>
-      <w:r>
-        <w:rPr>
-          <w:sz w:val="18"/>
-          <w:szCs w:val="18"/>
-        </w:rPr>
-        <w:t>4.6. При выполнении требований пунктов 2.</w:t>
-      </w:r>
-      <w:r>
-        <w:rPr>
-          <w:sz w:val="18"/>
-          <w:szCs w:val="18"/>
-        </w:rPr>
-        <w:t>2.5 и 2.2.11</w:t>
-      </w:r>
-      <w:r>
-        <w:rPr>
-          <w:sz w:val="18"/>
-          <w:szCs w:val="18"/>
-        </w:rPr>
-        <w:t xml:space="preserve"> настоящего договора после ДТП Арендодатель выполняет ремонт автомобиля за счет страхового покрытия при условии оплаты арендатором </w:t>
-      </w:r>
-      <w:r>
-        <w:rPr>
-          <w:color w:val="FF0000"/>
-          <w:sz w:val="18"/>
-          <w:szCs w:val="18"/>
-        </w:rPr>
-        <w:t xml:space="preserve">безусловной франшизы в размере </w:t>
-      </w:r>
-      <w:r>
-        <w:rPr>
-          <w:color w:val="FF0000"/>
-          <w:sz w:val="18"/>
-          <w:szCs w:val="18"/>
-        </w:rPr>
-        <w:t>50 000</w:t>
-      </w:r>
-      <w:r>
-        <w:rPr>
-          <w:color w:val="FF0000"/>
-          <w:sz w:val="18"/>
-          <w:szCs w:val="18"/>
-        </w:rPr>
-        <w:t xml:space="preserve"> (</w:t>
-      </w:r>
-      <w:r>
-        <w:rPr>
-          <w:color w:val="FF0000"/>
-          <w:sz w:val="18"/>
-          <w:szCs w:val="18"/>
-        </w:rPr>
-        <w:t>Пятьдесят тысяч</w:t>
-      </w:r>
-      <w:r>
-        <w:rPr>
-          <w:color w:val="FF0000"/>
-          <w:sz w:val="18"/>
-          <w:szCs w:val="18"/>
-        </w:rPr>
-        <w:t>)</w:t>
-      </w:r>
-      <w:r>
-        <w:rPr>
-          <w:color w:val="FF0000"/>
-          <w:sz w:val="18"/>
-          <w:szCs w:val="18"/>
-        </w:rPr>
-        <w:t xml:space="preserve"> рублей</w:t>
-      </w:r>
-    </w:p>
-    <w:p>
-      <w:pPr>
-        <w:tabs>
-          <w:tab w:val="left" w:pos="180"/>
-        </w:tabs>
-        <w:jc w:val="both"/>
-        <w:rPr>
-          <w:sz w:val="18"/>
-          <w:szCs w:val="18"/>
-        </w:rPr>
-      </w:pPr>
-      <w:r>
-        <w:rPr>
-          <w:sz w:val="18"/>
-          <w:szCs w:val="18"/>
-        </w:rPr>
-        <w:t xml:space="preserve">4.7. </w:t>
-      </w:r>
-      <w:r>
-        <w:rPr>
-          <w:b/>
-          <w:sz w:val="18"/>
-          <w:szCs w:val="18"/>
-        </w:rPr>
-        <w:t>Арендатор</w:t>
-      </w:r>
-      <w:r>
-        <w:rPr>
-          <w:sz w:val="18"/>
-          <w:szCs w:val="18"/>
-        </w:rPr>
-        <w:t xml:space="preserve"> несет ответственность по оплате всех штрафов, наложенных в процессе эксплуатации автомобиля, по средствам видео-фиксации нарушений ПДД. (такие нарушения как превышения скорости, проезд на красный сигнал светофора, нарушение дорожной разметки.) При этом оплата суммы штрафа </w:t>
-      </w:r>
-      <w:r>
-        <w:rPr>
-          <w:b/>
-          <w:sz w:val="18"/>
-          <w:szCs w:val="18"/>
-        </w:rPr>
-        <w:t>Арендатор</w:t>
-      </w:r>
-      <w:r>
-        <w:rPr>
-          <w:sz w:val="18"/>
-          <w:szCs w:val="18"/>
-        </w:rPr>
-        <w:t xml:space="preserve"> возмещает </w:t>
-      </w:r>
-      <w:r>
-        <w:rPr>
-          <w:b/>
-          <w:sz w:val="18"/>
-          <w:szCs w:val="18"/>
-        </w:rPr>
-        <w:t>Арендодателю</w:t>
-      </w:r>
-      <w:r>
-        <w:rPr>
-          <w:b/>
-          <w:sz w:val="18"/>
-          <w:szCs w:val="18"/>
-        </w:rPr>
-        <w:t xml:space="preserve"> </w:t>
-      </w:r>
-      <w:r>
-        <w:rPr>
-          <w:sz w:val="18"/>
-          <w:szCs w:val="18"/>
-        </w:rPr>
-        <w:t>косвенные расходы по оплате данного штрафа в размере 20% от его суммы (налоги, обработка штрафов, перечисление штрафов в бюджет и пр.)</w:t>
-      </w:r>
-    </w:p>
-    <w:p>
-      <w:pPr>
-        <w:tabs>
-          <w:tab w:val="left" w:pos="180"/>
-        </w:tabs>
-        <w:jc w:val="both"/>
-        <w:rPr>
-          <w:sz w:val="18"/>
-          <w:szCs w:val="18"/>
-        </w:rPr>
-      </w:pPr>
-      <w:r>
-        <w:rPr>
-          <w:sz w:val="18"/>
-          <w:szCs w:val="18"/>
-        </w:rPr>
-        <w:t xml:space="preserve">4.8. </w:t>
-      </w:r>
-      <w:r>
-        <w:rPr>
-          <w:b/>
-          <w:sz w:val="18"/>
-          <w:szCs w:val="18"/>
-        </w:rPr>
-        <w:t>В</w:t>
-      </w:r>
-      <w:r>
-        <w:rPr>
-          <w:b/>
-          <w:sz w:val="18"/>
-          <w:szCs w:val="18"/>
-        </w:rPr>
-        <w:t xml:space="preserve"> случае превышения скоростного режима автомобиля более 90 км/час в городе и более 129</w:t>
-      </w:r>
-      <w:r>
-        <w:rPr>
-          <w:b/>
-          <w:sz w:val="18"/>
-          <w:szCs w:val="18"/>
-        </w:rPr>
-        <w:t xml:space="preserve"> км/час за городом, Арендатор оплачивает Арендодателю штраф в размере </w:t>
-      </w:r>
-      <w:r>
-        <w:rPr>
-          <w:b/>
-          <w:sz w:val="18"/>
-          <w:szCs w:val="18"/>
-        </w:rPr>
-        <w:t>5000 рублей.</w:t>
-      </w:r>
-    </w:p>
-    <w:p>
-      <w:pPr>
-        <w:tabs>
-          <w:tab w:val="left" w:pos="180"/>
-        </w:tabs>
-        <w:jc w:val="both"/>
-        <w:rPr>
           <w:b/>
           <w:sz w:val="18"/>
           <w:szCs w:val="18"/>
         </w:rPr>
         <w:sectPr>
-          <w:headerReference w:type="even" r:id="rId9"/>
-          <w:headerReference w:type="default" r:id="rId10"/>
-          <w:footerReference w:type="even" r:id="rId11"/>
-          <w:footerReference w:type="default" r:id="rId12"/>
-          <w:headerReference w:type="first" r:id="rId13"/>
-          <w:footerReference w:type="first" r:id="rId14"/>
+          <w:footerReference w:type="default" r:id="rId9"/>
           <w:type w:val="continuous"/>
           <w:pgSz w:w="11906" w:h="16838"/>
           <w:pgMar w:top="720" w:right="720" w:bottom="568" w:left="720" w:header="284" w:footer="709" w:gutter="0"/>
@@ -4460,7 +4699,6 @@
           <w:sz w:val="18"/>
           <w:szCs w:val="18"/>
         </w:rPr>
-        <w:lastRenderedPageBreak/>
         <w:t>5. РАСТОРЖЕНИЕ И ПРЕКРАЩЕНИЕ ДОГОВОРА</w:t>
       </w:r>
     </w:p>
@@ -4530,23 +4768,7 @@
           <w:sz w:val="18"/>
           <w:szCs w:val="18"/>
         </w:rPr>
-        <w:t xml:space="preserve"> положений </w:t>
-      </w:r>
-      <w:proofErr w:type="spellStart"/>
-      <w:r>
-        <w:rPr>
-          <w:sz w:val="18"/>
-          <w:szCs w:val="18"/>
-        </w:rPr>
-        <w:t>п.п</w:t>
-      </w:r>
-      <w:proofErr w:type="spellEnd"/>
-      <w:r>
-        <w:rPr>
-          <w:sz w:val="18"/>
-          <w:szCs w:val="18"/>
-        </w:rPr>
-        <w:t>. 2.1.1., 2.1.2. настоящего Договора.</w:t>
+        <w:t xml:space="preserve"> положений п.п. 2.1.1., 2.1.2. настоящего Договора.</w:t>
       </w:r>
     </w:p>
     <w:p>
@@ -4617,23 +4839,7 @@
           <w:sz w:val="18"/>
           <w:szCs w:val="18"/>
         </w:rPr>
-        <w:t xml:space="preserve">, а также нарушение последним положений </w:t>
-      </w:r>
-      <w:proofErr w:type="spellStart"/>
-      <w:r>
-        <w:rPr>
-          <w:sz w:val="18"/>
-          <w:szCs w:val="18"/>
-        </w:rPr>
-        <w:t>п.п</w:t>
-      </w:r>
-      <w:proofErr w:type="spellEnd"/>
-      <w:r>
-        <w:rPr>
-          <w:sz w:val="18"/>
-          <w:szCs w:val="18"/>
-        </w:rPr>
-        <w:t xml:space="preserve">. 2.2.4 </w:t>
+        <w:t xml:space="preserve">, а также нарушение последним положений п.п. 2.2.4 </w:t>
       </w:r>
       <w:r>
         <w:rPr>
@@ -4794,23 +5000,7 @@
           <w:sz w:val="18"/>
           <w:szCs w:val="18"/>
         </w:rPr>
-        <w:t xml:space="preserve">5.5. При нарушении </w:t>
-      </w:r>
-      <w:proofErr w:type="spellStart"/>
-      <w:r>
-        <w:rPr>
-          <w:sz w:val="18"/>
-          <w:szCs w:val="18"/>
-        </w:rPr>
-        <w:t>п.п</w:t>
-      </w:r>
-      <w:proofErr w:type="spellEnd"/>
-      <w:r>
-        <w:rPr>
-          <w:sz w:val="18"/>
-          <w:szCs w:val="18"/>
-        </w:rPr>
-        <w:t>. 5.4</w:t>
+        <w:t>5.5. При нарушении п.п. 5.4</w:t>
       </w:r>
       <w:r>
         <w:rPr>
@@ -5218,7 +5408,10 @@
         <w:jc w:val="both"/>
       </w:pPr>
       <w:r>
-        <w:t xml:space="preserve">   </w:t>
+        <w:t xml:space="preserve"> </w:t>
+      </w:r>
+      <w:r>
+        <w:t xml:space="preserve">  </w:t>
       </w:r>
     </w:p>
     <w:tbl>
@@ -5232,11 +5425,11 @@
           <w:insideH w:val="single" w:sz="4" w:space="0" w:color="auto"/>
           <w:insideV w:val="single" w:sz="4" w:space="0" w:color="auto"/>
         </w:tblBorders>
-        <w:tblLook w:val="01E0" w:firstRow="1" w:lastRow="1" w:firstColumn="1" w:lastColumn="1" w:noHBand="0" w:noVBand="0"/>
+        <w:tblLook w:val="01E0"/>
       </w:tblPr>
       <w:tblGrid>
-        <w:gridCol w:w="5293"/>
-        <w:gridCol w:w="5163"/>
+        <w:gridCol w:w="5400"/>
+        <w:gridCol w:w="5282"/>
       </w:tblGrid>
       <w:tr>
         <w:tc>
@@ -5324,55 +5517,7 @@
                 <w:sz w:val="18"/>
                 <w:szCs w:val="18"/>
               </w:rPr>
-              <w:t xml:space="preserve">Юридический адрес: 630102, </w:t>
-            </w:r>
-            <w:proofErr w:type="spellStart"/>
-            <w:r>
-              <w:rPr>
-                <w:sz w:val="18"/>
-                <w:szCs w:val="18"/>
-              </w:rPr>
-              <w:t>г.Новосибирск</w:t>
-            </w:r>
-            <w:proofErr w:type="spellEnd"/>
-            <w:r>
-              <w:rPr>
-                <w:sz w:val="18"/>
-                <w:szCs w:val="18"/>
-              </w:rPr>
-              <w:t xml:space="preserve">, ул. </w:t>
-            </w:r>
-            <w:proofErr w:type="spellStart"/>
-            <w:r>
-              <w:rPr>
-                <w:sz w:val="18"/>
-                <w:szCs w:val="18"/>
-              </w:rPr>
-              <w:t>Инская</w:t>
-            </w:r>
-            <w:proofErr w:type="spellEnd"/>
-            <w:r>
-              <w:rPr>
-                <w:sz w:val="18"/>
-                <w:szCs w:val="18"/>
-              </w:rPr>
-              <w:t xml:space="preserve"> </w:t>
-            </w:r>
-            <w:proofErr w:type="gramStart"/>
-            <w:r>
-              <w:rPr>
-                <w:sz w:val="18"/>
-                <w:szCs w:val="18"/>
-              </w:rPr>
-              <w:t>3,к.</w:t>
-            </w:r>
-            <w:proofErr w:type="gramEnd"/>
-            <w:r>
-              <w:rPr>
-                <w:sz w:val="18"/>
-                <w:szCs w:val="18"/>
-              </w:rPr>
-              <w:t>18</w:t>
+              <w:t>Юридический адрес: 630102, г.Новосибирск, ул. Инская 3,к.18</w:t>
             </w:r>
           </w:p>
           <w:p>
@@ -5398,7 +5543,14 @@
                 <w:sz w:val="18"/>
                 <w:szCs w:val="18"/>
               </w:rPr>
-              <w:t>: +79139132808</w:t>
+              <w:t>:</w:t>
+            </w:r>
+            <w:r>
+              <w:rPr>
+                <w:sz w:val="18"/>
+                <w:szCs w:val="18"/>
+              </w:rPr>
+              <w:t xml:space="preserve"> +79139132808</w:t>
             </w:r>
           </w:p>
           <w:p>
@@ -5424,7 +5576,14 @@
                 <w:sz w:val="18"/>
                 <w:szCs w:val="18"/>
               </w:rPr>
-              <w:t>: 5405065213</w:t>
+              <w:t>:</w:t>
+            </w:r>
+            <w:r>
+              <w:rPr>
+                <w:sz w:val="18"/>
+                <w:szCs w:val="18"/>
+              </w:rPr>
+              <w:t xml:space="preserve"> 5405065213</w:t>
             </w:r>
           </w:p>
           <w:p>
@@ -5464,7 +5623,14 @@
                 <w:sz w:val="18"/>
                 <w:szCs w:val="18"/>
               </w:rPr>
-              <w:t>: 40702810013410001297</w:t>
+              <w:t>:</w:t>
+            </w:r>
+            <w:r>
+              <w:rPr>
+                <w:sz w:val="18"/>
+                <w:szCs w:val="18"/>
+              </w:rPr>
+              <w:t xml:space="preserve"> 40702810013410001297</w:t>
             </w:r>
           </w:p>
           <w:p>
@@ -5678,7 +5844,7 @@
         </w:tabs>
         <w:jc w:val="both"/>
         <w:sectPr>
-          <w:footerReference w:type="default" r:id="rId15"/>
+          <w:footerReference w:type="default" r:id="rId10"/>
           <w:type w:val="continuous"/>
           <w:pgSz w:w="11906" w:h="16838"/>
           <w:pgMar w:top="720" w:right="720" w:bottom="720" w:left="720" w:header="283" w:footer="709" w:gutter="0"/>
@@ -5747,11 +5913,11 @@
     <w:tbl>
       <w:tblPr>
         <w:tblW w:w="0" w:type="auto"/>
-        <w:tblLook w:val="01E0" w:firstRow="1" w:lastRow="1" w:firstColumn="1" w:lastColumn="1" w:noHBand="0" w:noVBand="0"/>
+        <w:tblLook w:val="01E0"/>
       </w:tblPr>
       <w:tblGrid>
-        <w:gridCol w:w="5281"/>
-        <w:gridCol w:w="5185"/>
+        <w:gridCol w:w="5392"/>
+        <w:gridCol w:w="5290"/>
       </w:tblGrid>
       <w:tr>
         <w:trPr>
@@ -5779,90 +5945,25 @@
                 <w:sz w:val="18"/>
                 <w:szCs w:val="18"/>
               </w:rPr>
-              <mc:AlternateContent>
-                <mc:Choice Requires="wps">
-                  <w:drawing>
-                    <wp:anchor distT="0" distB="0" distL="114300" distR="114300" simplePos="0" relativeHeight="251660800" behindDoc="0" locked="0" layoutInCell="1" allowOverlap="1">
-                      <wp:simplePos x="0" y="0"/>
-                      <wp:positionH relativeFrom="column">
-                        <wp:posOffset>3107055</wp:posOffset>
-                      </wp:positionH>
-                      <wp:positionV relativeFrom="paragraph">
-                        <wp:posOffset>272415</wp:posOffset>
-                      </wp:positionV>
-                      <wp:extent cx="371475" cy="90805"/>
-                      <wp:effectExtent l="30480" t="16510" r="17145" b="16510"/>
-                      <wp:wrapNone/>
-                      <wp:docPr id="6" name="Стрелка вправо с вырезом 6"/>
-                      <wp:cNvGraphicFramePr>
-                        <a:graphicFrameLocks xmlns:a="http://schemas.openxmlformats.org/drawingml/2006/main"/>
-                      </wp:cNvGraphicFramePr>
-                      <a:graphic xmlns:a="http://schemas.openxmlformats.org/drawingml/2006/main">
-                        <a:graphicData uri="http://schemas.microsoft.com/office/word/2010/wordprocessingShape">
-                          <wps:wsp>
-                            <wps:cNvSpPr>
-                              <a:spLocks noChangeArrowheads="1"/>
-                            </wps:cNvSpPr>
-                            <wps:spPr bwMode="auto">
-                              <a:xfrm>
-                                <a:off x="0" y="0"/>
-                                <a:ext cx="371475" cy="90805"/>
-                              </a:xfrm>
-                              <a:prstGeom prst="notchedRightArrow">
-                                <a:avLst>
-                                  <a:gd name="adj1" fmla="val 50000"/>
-                                  <a:gd name="adj2" fmla="val 102273"/>
-                                </a:avLst>
-                              </a:prstGeom>
-                              <a:solidFill>
-                                <a:srgbClr val="FFFFFF"/>
-                              </a:solidFill>
-                              <a:ln w="9525">
-                                <a:solidFill>
-                                  <a:srgbClr val="000000"/>
-                                </a:solidFill>
-                                <a:miter lim="800000"/>
-                                <a:headEnd/>
-                                <a:tailEnd/>
-                              </a:ln>
-                            </wps:spPr>
-                            <wps:bodyPr rot="0" vert="horz" wrap="square" lIns="91440" tIns="45720" rIns="91440" bIns="45720" anchor="t" anchorCtr="0" upright="1">
-                              <a:noAutofit/>
-                            </wps:bodyPr>
-                          </wps:wsp>
-                        </a:graphicData>
-                      </a:graphic>
-                      <wp14:sizeRelH relativeFrom="page">
-                        <wp14:pctWidth>0</wp14:pctWidth>
-                      </wp14:sizeRelH>
-                      <wp14:sizeRelV relativeFrom="page">
-                        <wp14:pctHeight>0</wp14:pctHeight>
-                      </wp14:sizeRelV>
-                    </wp:anchor>
-                  </w:drawing>
-                </mc:Choice>
-                <mc:Fallback>
-                  <w:pict>
-                    <v:shapetype w14:anchorId="6BF3C0BA" id="_x0000_t94" coordsize="21600,21600" o:spt="94" adj="16200,5400" path="m@0,l@0@1,0@1@5,10800,0@2@0@2@0,21600,21600,10800xe">
-                      <v:stroke joinstyle="miter"/>
-                      <v:formulas>
-                        <v:f eqn="val #0"/>
-                        <v:f eqn="val #1"/>
-                        <v:f eqn="sum height 0 #1"/>
-                        <v:f eqn="sum 10800 0 #1"/>
-                        <v:f eqn="sum width 0 #0"/>
-                        <v:f eqn="prod @4 @3 10800"/>
-                        <v:f eqn="sum width 0 @5"/>
-                      </v:formulas>
-                      <v:path o:connecttype="custom" o:connectlocs="@0,0;@5,10800;@0,21600;21600,10800" o:connectangles="270,180,90,0" textboxrect="@5,@1,@6,@2"/>
-                      <v:handles>
-                        <v:h position="#0,#1" xrange="0,21600" yrange="0,10800"/>
-                      </v:handles>
-                    </v:shapetype>
-                    <v:shape id="Стрелка вправо с вырезом 6" o:spid="_x0000_s1026" type="#_x0000_t94" style="position:absolute;margin-left:244.65pt;margin-top:21.45pt;width:29.25pt;height:7.15pt;z-index:251660800;visibility:visible;mso-wrap-style:square;mso-width-percent:0;mso-height-percent:0;mso-wrap-distance-left:9pt;mso-wrap-distance-top:0;mso-wrap-distance-right:9pt;mso-wrap-distance-bottom:0;mso-position-horizontal:absolute;mso-position-horizontal-relative:text;mso-position-vertical:absolute;mso-position-vertical-relative:text;mso-width-percent:0;mso-height-percent:0;mso-width-relative:page;mso-height-relative:page;v-text-anchor:top" o:gfxdata="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"/>
-                  </w:pict>
-                </mc:Fallback>
-              </mc:AlternateContent>
+              <w:pict>
+                <v:shapetype id="_x0000_t94" coordsize="21600,21600" o:spt="94" adj="16200,5400" path="m@0,l@0@1,0@1@5,10800,0@2@0@2@0,21600,21600,10800xe">
+                  <v:stroke joinstyle="miter"/>
+                  <v:formulas>
+                    <v:f eqn="val #0"/>
+                    <v:f eqn="val #1"/>
+                    <v:f eqn="sum height 0 #1"/>
+                    <v:f eqn="sum 10800 0 #1"/>
+                    <v:f eqn="sum width 0 #0"/>
+                    <v:f eqn="prod @4 @3 10800"/>
+                    <v:f eqn="sum width 0 @5"/>
+                  </v:formulas>
+                  <v:path o:connecttype="custom" o:connectlocs="@0,0;@5,10800;@0,21600;21600,10800" o:connectangles="270,180,90,0" textboxrect="@5,@1,@6,@2"/>
+                  <v:handles>
+                    <v:h position="#0,#1" xrange="0,21600" yrange="0,10800"/>
+                  </v:handles>
+                </v:shapetype>
+                <v:shape id="_x0000_s1034" type="#_x0000_t94" style="position:absolute;left:0;text-align:left;margin-left:244.65pt;margin-top:21.45pt;width:29.25pt;height:7.15pt;z-index:251656704"/>
+              </w:pict>
             </w:r>
             <w:r>
               <w:rPr>
@@ -5934,25 +6035,7 @@
                 <w:szCs w:val="18"/>
                 <w:lang w:val="en-US"/>
               </w:rPr>
-              <w:t>ООО "</w:t>
-            </w:r>
-            <w:proofErr w:type="spellStart"/>
-            <w:r>
-              <w:rPr>
-                <w:sz w:val="18"/>
-                <w:szCs w:val="18"/>
-                <w:lang w:val="en-US"/>
-              </w:rPr>
-              <w:t>Рентасиб</w:t>
-            </w:r>
-            <w:proofErr w:type="spellEnd"/>
-            <w:r>
-              <w:rPr>
-                <w:sz w:val="18"/>
-                <w:szCs w:val="18"/>
-                <w:lang w:val="en-US"/>
-              </w:rPr>
-              <w:t>"</w:t>
+              <w:t>ООО "Рентасиб"</w:t>
             </w:r>
             <w:r>
               <w:rPr>
@@ -6073,7 +6156,13 @@
         <w:rPr>
           <w:i/>
         </w:rPr>
-        <w:t xml:space="preserve">От </w:t>
+        <w:t>От</w:t>
+      </w:r>
+      <w:r>
+        <w:rPr>
+          <w:i/>
+        </w:rPr>
+        <w:t xml:space="preserve"> </w:t>
       </w:r>
       <w:r>
         <w:rPr>
@@ -6086,7 +6175,20 @@
           <w:b/>
           <w:lang w:val="en-US"/>
         </w:rPr>
-        <w:t>.09.2026, 0</w:t>
+        <w:t>.</w:t>
+      </w:r>
+      <w:r>
+        <w:rPr>
+          <w:b/>
+        </w:rPr>
+        <w:t>10</w:t>
+      </w:r>
+      <w:r>
+        <w:rPr>
+          <w:b/>
+          <w:lang w:val="en-US"/>
+        </w:rPr>
+        <w:t>.2026, 0</w:t>
       </w:r>
       <w:r>
         <w:rPr>
@@ -6130,7 +6232,13 @@
         <w:rPr>
           <w:b/>
         </w:rPr>
-        <w:t>АКТ ПЕРЕДАЧИ ТРАНСПОРТНОГО СРЕДСТВА (выдача)</w:t>
+        <w:t>АКТ ПЕРЕДАЧИ ТРАНСПОРТНОГО СРЕДСТВА</w:t>
+      </w:r>
+      <w:r>
+        <w:rPr>
+          <w:b/>
+        </w:rPr>
+        <w:t xml:space="preserve"> (выдача)</w:t>
       </w:r>
     </w:p>
     <w:p>
@@ -6157,7 +6265,7 @@
           <w:insideV w:val="single" w:sz="4" w:space="0" w:color="auto"/>
         </w:tblBorders>
         <w:tblLayout w:type="fixed"/>
-        <w:tblLook w:val="01E0" w:firstRow="1" w:lastRow="1" w:firstColumn="1" w:lastColumn="1" w:noHBand="0" w:noVBand="0"/>
+        <w:tblLook w:val="01E0"/>
       </w:tblPr>
       <w:tblGrid>
         <w:gridCol w:w="1727"/>
@@ -6437,7 +6545,21 @@
                 <w:b/>
                 <w:sz w:val="20"/>
               </w:rPr>
-              <w:t>7777 №777777 , выдан Отделом УФМС России по Новосибирской области районе г. Новосибирска 30.09.2024</w:t>
+              <w:t>7777 №777777 ,</w:t>
+            </w:r>
+            <w:r>
+              <w:rPr>
+                <w:b/>
+                <w:sz w:val="20"/>
+              </w:rPr>
+              <w:t xml:space="preserve"> </w:t>
+            </w:r>
+            <w:r>
+              <w:rPr>
+                <w:b/>
+                <w:sz w:val="20"/>
+              </w:rPr>
+              <w:t xml:space="preserve"> выдан Отделом УФМС России по Новосибирской области районе г. Новосибирска 30.09.2024</w:t>
             </w:r>
           </w:p>
         </w:tc>
@@ -6987,7 +7109,6 @@
                 <w:lang w:val="en-US"/>
               </w:rPr>
             </w:pPr>
-            <w:proofErr w:type="spellStart"/>
             <w:r>
               <w:rPr>
                 <w:b/>
@@ -6997,13 +7118,12 @@
               </w:rPr>
               <w:t>серый</w:t>
             </w:r>
-            <w:proofErr w:type="spellEnd"/>
           </w:p>
         </w:tc>
       </w:tr>
       <w:tr>
         <w:tblPrEx>
-          <w:tblLook w:val="0000" w:firstRow="0" w:lastRow="0" w:firstColumn="0" w:lastColumn="0" w:noHBand="0" w:noVBand="0"/>
+          <w:tblLook w:val="0000"/>
         </w:tblPrEx>
         <w:trPr>
           <w:trHeight w:val="360"/>
@@ -7134,7 +7254,7 @@
           <w:noProof/>
         </w:rPr>
         <w:drawing>
-          <wp:inline distT="0" distB="0" distL="0" distR="0" wp14:anchorId="1AF852EB" wp14:editId="4391B5D2">
+          <wp:inline distT="0" distB="0" distL="0" distR="0">
             <wp:extent cx="3025140" cy="2735580"/>
             <wp:effectExtent l="19050" t="0" r="3810" b="0"/>
             <wp:docPr id="1" name="Рисунок 1"/>
@@ -7151,7 +7271,7 @@
                     </pic:cNvPicPr>
                   </pic:nvPicPr>
                   <pic:blipFill>
-                    <a:blip r:embed="rId16" cstate="print"/>
+                    <a:blip r:embed="rId11" cstate="print"/>
                     <a:srcRect/>
                     <a:stretch>
                       <a:fillRect/>
@@ -7236,74 +7356,9 @@
         <w:rPr>
           <w:noProof/>
         </w:rPr>
-        <mc:AlternateContent>
-          <mc:Choice Requires="wps">
-            <w:drawing>
-              <wp:anchor distT="0" distB="0" distL="114300" distR="114300" simplePos="0" relativeHeight="251661824" behindDoc="0" locked="0" layoutInCell="1" allowOverlap="1">
-                <wp:simplePos x="0" y="0"/>
-                <wp:positionH relativeFrom="column">
-                  <wp:posOffset>3640455</wp:posOffset>
-                </wp:positionH>
-                <wp:positionV relativeFrom="paragraph">
-                  <wp:posOffset>50165</wp:posOffset>
-                </wp:positionV>
-                <wp:extent cx="371475" cy="90805"/>
-                <wp:effectExtent l="30480" t="13970" r="17145" b="19050"/>
-                <wp:wrapNone/>
-                <wp:docPr id="5" name="Стрелка вправо с вырезом 5"/>
-                <wp:cNvGraphicFramePr>
-                  <a:graphicFrameLocks xmlns:a="http://schemas.openxmlformats.org/drawingml/2006/main"/>
-                </wp:cNvGraphicFramePr>
-                <a:graphic xmlns:a="http://schemas.openxmlformats.org/drawingml/2006/main">
-                  <a:graphicData uri="http://schemas.microsoft.com/office/word/2010/wordprocessingShape">
-                    <wps:wsp>
-                      <wps:cNvSpPr>
-                        <a:spLocks noChangeArrowheads="1"/>
-                      </wps:cNvSpPr>
-                      <wps:spPr bwMode="auto">
-                        <a:xfrm>
-                          <a:off x="0" y="0"/>
-                          <a:ext cx="371475" cy="90805"/>
-                        </a:xfrm>
-                        <a:prstGeom prst="notchedRightArrow">
-                          <a:avLst>
-                            <a:gd name="adj1" fmla="val 50000"/>
-                            <a:gd name="adj2" fmla="val 102273"/>
-                          </a:avLst>
-                        </a:prstGeom>
-                        <a:solidFill>
-                          <a:srgbClr val="FFFFFF"/>
-                        </a:solidFill>
-                        <a:ln w="9525">
-                          <a:solidFill>
-                            <a:srgbClr val="000000"/>
-                          </a:solidFill>
-                          <a:miter lim="800000"/>
-                          <a:headEnd/>
-                          <a:tailEnd/>
-                        </a:ln>
-                      </wps:spPr>
-                      <wps:bodyPr rot="0" vert="horz" wrap="square" lIns="91440" tIns="45720" rIns="91440" bIns="45720" anchor="t" anchorCtr="0" upright="1">
-                        <a:noAutofit/>
-                      </wps:bodyPr>
-                    </wps:wsp>
-                  </a:graphicData>
-                </a:graphic>
-                <wp14:sizeRelH relativeFrom="page">
-                  <wp14:pctWidth>0</wp14:pctWidth>
-                </wp14:sizeRelH>
-                <wp14:sizeRelV relativeFrom="page">
-                  <wp14:pctHeight>0</wp14:pctHeight>
-                </wp14:sizeRelV>
-              </wp:anchor>
-            </w:drawing>
-          </mc:Choice>
-          <mc:Fallback>
-            <w:pict>
-              <v:shape w14:anchorId="3F66505E" id="Стрелка вправо с вырезом 5" o:spid="_x0000_s1026" type="#_x0000_t94" style="position:absolute;margin-left:286.65pt;margin-top:3.95pt;width:29.25pt;height:7.15pt;z-index:251661824;visibility:visible;mso-wrap-style:square;mso-width-percent:0;mso-height-percent:0;mso-wrap-distance-left:9pt;mso-wrap-distance-top:0;mso-wrap-distance-right:9pt;mso-wrap-distance-bottom:0;mso-position-horizontal:absolute;mso-position-horizontal-relative:text;mso-position-vertical:absolute;mso-position-vertical-relative:text;mso-width-percent:0;mso-height-percent:0;mso-width-relative:page;mso-height-relative:page;v-text-anchor:top" o:gfxdata="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"/>
-            </w:pict>
-          </mc:Fallback>
-        </mc:AlternateContent>
+        <w:pict>
+          <v:shape id="_x0000_s1035" type="#_x0000_t94" style="position:absolute;margin-left:286.65pt;margin-top:3.95pt;width:29.25pt;height:7.15pt;z-index:251657728"/>
+        </w:pict>
       </w:r>
       <w:r>
         <w:t>________</w:t>
@@ -7316,30 +7371,28 @@
           <w:sz w:val="18"/>
           <w:szCs w:val="18"/>
         </w:rPr>
-        <w:t>ООО "</w:t>
-      </w:r>
-      <w:proofErr w:type="spellStart"/>
-      <w:r>
-        <w:rPr>
-          <w:sz w:val="18"/>
-          <w:szCs w:val="18"/>
-        </w:rPr>
-        <w:t>Рентасиб</w:t>
-      </w:r>
-      <w:proofErr w:type="spellEnd"/>
-      <w:r>
-        <w:rPr>
-          <w:sz w:val="18"/>
-          <w:szCs w:val="18"/>
-        </w:rPr>
-        <w:t>"</w:t>
-      </w:r>
-      <w:r>
-        <w:rPr>
-          <w:sz w:val="18"/>
-          <w:szCs w:val="18"/>
-        </w:rPr>
-        <w:t xml:space="preserve">                                                                                  </w:t>
+        <w:t>ООО "Рентасиб"</w:t>
+      </w:r>
+      <w:r>
+        <w:rPr>
+          <w:sz w:val="18"/>
+          <w:szCs w:val="18"/>
+        </w:rPr>
+        <w:t xml:space="preserve">                                               </w:t>
+      </w:r>
+      <w:r>
+        <w:rPr>
+          <w:sz w:val="18"/>
+          <w:szCs w:val="18"/>
+        </w:rPr>
+        <w:t xml:space="preserve">                                </w:t>
+      </w:r>
+      <w:r>
+        <w:rPr>
+          <w:sz w:val="18"/>
+          <w:szCs w:val="18"/>
+        </w:rPr>
+        <w:t xml:space="preserve">   </w:t>
       </w:r>
       <w:r>
         <w:rPr>
@@ -7353,7 +7406,14 @@
           <w:sz w:val="18"/>
           <w:szCs w:val="18"/>
         </w:rPr>
-        <w:t>Егоров К.А.</w:t>
+        <w:t>Иванов И.И</w:t>
+      </w:r>
+      <w:r>
+        <w:rPr>
+          <w:sz w:val="18"/>
+          <w:szCs w:val="18"/>
+        </w:rPr>
+        <w:t>.</w:t>
       </w:r>
       <w:r>
         <w:rPr>
@@ -7369,6 +7429,17 @@
         <w:tabs>
           <w:tab w:val="left" w:pos="180"/>
         </w:tabs>
+        <w:rPr>
+          <w:sz w:val="18"/>
+          <w:szCs w:val="18"/>
+        </w:rPr>
+      </w:pPr>
+    </w:p>
+    <w:p>
+      <w:pPr>
+        <w:tabs>
+          <w:tab w:val="left" w:pos="180"/>
+        </w:tabs>
       </w:pPr>
       <w:r>
         <w:rPr>
@@ -7422,7 +7493,10 @@
         <w:jc w:val="right"/>
       </w:pPr>
       <w:r>
-        <w:t xml:space="preserve"> Приложение № 3</w:t>
+        <w:t xml:space="preserve"> </w:t>
+      </w:r>
+      <w:r>
+        <w:t>Приложение № 3</w:t>
       </w:r>
     </w:p>
     <w:p>
@@ -7459,7 +7533,10 @@
         <w:t xml:space="preserve"> «01</w:t>
       </w:r>
       <w:r>
-        <w:t>» сентября 2026</w:t>
+        <w:t>» октября</w:t>
+      </w:r>
+      <w:r>
+        <w:t xml:space="preserve"> 2026</w:t>
       </w:r>
     </w:p>
     <w:p>
@@ -7872,22 +7949,11 @@
     <w:p/>
     <w:p/>
     <w:p/>
-    <w:p>
-      <w:pPr>
-        <w:tabs>
-          <w:tab w:val="left" w:pos="180"/>
-          <w:tab w:val="center" w:pos="5386"/>
-          <w:tab w:val="left" w:pos="9930"/>
-        </w:tabs>
-        <w:spacing w:before="240" w:after="60"/>
-        <w:jc w:val="center"/>
-      </w:pPr>
-    </w:p>
     <w:sectPr>
-      <w:footerReference w:type="default" r:id="rId17"/>
+      <w:footerReference w:type="default" r:id="rId12"/>
       <w:type w:val="continuous"/>
       <w:pgSz w:w="11906" w:h="16838"/>
-      <w:pgMar w:top="720" w:right="720" w:bottom="720" w:left="720" w:header="284" w:footer="709" w:gutter="0"/>
+      <w:pgMar w:top="720" w:right="720" w:bottom="720" w:left="720" w:header="142" w:footer="709" w:gutter="0"/>
       <w:cols w:space="708"/>
       <w:docGrid w:linePitch="360"/>
     </w:sectPr>
@@ -7896,15 +7962,15 @@
 </file>
 
 <file path=word/endnotes.xml><?xml version="1.0" encoding="utf-8"?>
-<w:endnotes xmlns:wpc="http://schemas.microsoft.com/office/word/2010/wordprocessingCanvas" xmlns:cx="http://schemas.microsoft.com/office/drawing/2014/chartex" xmlns:cx1="http://schemas.microsoft.com/office/drawing/2015/9/8/chartex" xmlns:mc="http://schemas.openxmlformats.org/markup-compatibility/2006" xmlns:o="urn:schemas-microsoft-com:office:office" xmlns:r="http://schemas.openxmlformats.org/officeDocument/2006/relationships" xmlns:m="http://schemas.openxmlformats.org/officeDocument/2006/math" xmlns:v="urn:schemas-microsoft-com:vml" xmlns:wp14="http://schemas.microsoft.com/office/word/2010/wordprocessingDrawing" xmlns:wp="http://schemas.openxmlformats.org/drawingml/2006/wordprocessingDrawing" xmlns:w10="urn:schemas-microsoft-com:office:word" xmlns:w="http://schemas.openxmlformats.org/wordprocessingml/2006/main" xmlns:w14="http://schemas.microsoft.com/office/word/2010/wordml" xmlns:w15="http://schemas.microsoft.com/office/word/2012/wordml" xmlns:w16se="http://schemas.microsoft.com/office/word/2015/wordml/symex" xmlns:wpg="http://schemas.microsoft.com/office/word/2010/wordprocessingGroup" xmlns:wpi="http://schemas.microsoft.com/office/word/2010/wordprocessingInk" xmlns:wne="http://schemas.microsoft.com/office/word/2006/wordml" xmlns:wps="http://schemas.microsoft.com/office/word/2010/wordprocessingShape" mc:Ignorable="w14 w15 w16se wp14">
-  <w:endnote w:type="separator" w:id="-1">
+<w:endnotes xmlns:ve="http://schemas.openxmlformats.org/markup-compatibility/2006" xmlns:o="urn:schemas-microsoft-com:office:office" xmlns:r="http://schemas.openxmlformats.org/officeDocument/2006/relationships" xmlns:m="http://schemas.openxmlformats.org/officeDocument/2006/math" xmlns:v="urn:schemas-microsoft-com:vml" xmlns:wp="http://schemas.openxmlformats.org/drawingml/2006/wordprocessingDrawing" xmlns:w10="urn:schemas-microsoft-com:office:word" xmlns:w="http://schemas.openxmlformats.org/wordprocessingml/2006/main" xmlns:wne="http://schemas.microsoft.com/office/word/2006/wordml">
+  <w:endnote w:type="separator" w:id="0">
     <w:p>
       <w:r>
         <w:separator/>
       </w:r>
     </w:p>
   </w:endnote>
-  <w:endnote w:type="continuationSeparator" w:id="0">
+  <w:endnote w:type="continuationSeparator" w:id="1">
     <w:p>
       <w:r>
         <w:continuationSeparator/>
@@ -7915,17 +7981,7 @@
 </file>
 
 <file path=word/footer1.xml><?xml version="1.0" encoding="utf-8"?>
-<w:ftr xmlns:wpc="http://schemas.microsoft.com/office/word/2010/wordprocessingCanvas" xmlns:cx="http://schemas.microsoft.com/office/drawing/2014/chartex" xmlns:cx1="http://schemas.microsoft.com/office/drawing/2015/9/8/chartex" xmlns:mc="http://schemas.openxmlformats.org/markup-compatibility/2006" xmlns:o="urn:schemas-microsoft-com:office:office" xmlns:r="http://schemas.openxmlformats.org/officeDocument/2006/relationships" xmlns:m="http://schemas.openxmlformats.org/officeDocument/2006/math" xmlns:v="urn:schemas-microsoft-com:vml" xmlns:wp14="http://schemas.microsoft.com/office/word/2010/wordprocessingDrawing" xmlns:wp="http://schemas.openxmlformats.org/drawingml/2006/wordprocessingDrawing" xmlns:w10="urn:schemas-microsoft-com:office:word" xmlns:w="http://schemas.openxmlformats.org/wordprocessingml/2006/main" xmlns:w14="http://schemas.microsoft.com/office/word/2010/wordml" xmlns:w15="http://schemas.microsoft.com/office/word/2012/wordml" xmlns:w16se="http://schemas.microsoft.com/office/word/2015/wordml/symex" xmlns:wpg="http://schemas.microsoft.com/office/word/2010/wordprocessingGroup" xmlns:wpi="http://schemas.microsoft.com/office/word/2010/wordprocessingInk" xmlns:wne="http://schemas.microsoft.com/office/word/2006/wordml" xmlns:wps="http://schemas.microsoft.com/office/word/2010/wordprocessingShape" mc:Ignorable="w14 w15 w16se wp14">
-  <w:p>
-    <w:pPr>
-      <w:pStyle w:val="ae"/>
-    </w:pPr>
-  </w:p>
-</w:ftr>
-</file>
-
-<file path=word/footer2.xml><?xml version="1.0" encoding="utf-8"?>
-<w:ftr xmlns:wpc="http://schemas.microsoft.com/office/word/2010/wordprocessingCanvas" xmlns:cx="http://schemas.microsoft.com/office/drawing/2014/chartex" xmlns:cx1="http://schemas.microsoft.com/office/drawing/2015/9/8/chartex" xmlns:mc="http://schemas.openxmlformats.org/markup-compatibility/2006" xmlns:o="urn:schemas-microsoft-com:office:office" xmlns:r="http://schemas.openxmlformats.org/officeDocument/2006/relationships" xmlns:m="http://schemas.openxmlformats.org/officeDocument/2006/math" xmlns:v="urn:schemas-microsoft-com:vml" xmlns:wp14="http://schemas.microsoft.com/office/word/2010/wordprocessingDrawing" xmlns:wp="http://schemas.openxmlformats.org/drawingml/2006/wordprocessingDrawing" xmlns:w10="urn:schemas-microsoft-com:office:word" xmlns:w="http://schemas.openxmlformats.org/wordprocessingml/2006/main" xmlns:w14="http://schemas.microsoft.com/office/word/2010/wordml" xmlns:w15="http://schemas.microsoft.com/office/word/2012/wordml" xmlns:w16se="http://schemas.microsoft.com/office/word/2015/wordml/symex" xmlns:wpg="http://schemas.microsoft.com/office/word/2010/wordprocessingGroup" xmlns:wpi="http://schemas.microsoft.com/office/word/2010/wordprocessingInk" xmlns:wne="http://schemas.microsoft.com/office/word/2006/wordml" xmlns:wps="http://schemas.microsoft.com/office/word/2010/wordprocessingShape" mc:Ignorable="w14 w15 w16se wp14">
+<w:ftr xmlns:ve="http://schemas.openxmlformats.org/markup-compatibility/2006" xmlns:o="urn:schemas-microsoft-com:office:office" xmlns:r="http://schemas.openxmlformats.org/officeDocument/2006/relationships" xmlns:m="http://schemas.openxmlformats.org/officeDocument/2006/math" xmlns:v="urn:schemas-microsoft-com:vml" xmlns:wp="http://schemas.openxmlformats.org/drawingml/2006/wordprocessingDrawing" xmlns:w10="urn:schemas-microsoft-com:office:word" xmlns:w="http://schemas.openxmlformats.org/wordprocessingml/2006/main" xmlns:wne="http://schemas.microsoft.com/office/word/2006/wordml">
   <w:p>
     <w:pPr>
       <w:tabs>
@@ -7961,7 +8017,7 @@
             <v:h position="#0,#1" xrange="0,21600" yrange="0,10800"/>
           </v:handles>
         </v:shapetype>
-        <v:shape id="_x0000_s2051" type="#_x0000_t94" style="position:absolute;margin-left:348.85pt;margin-top:3.05pt;width:29.25pt;height:7.15pt;z-index:251659264"/>
+        <v:shape id="_x0000_s39937" type="#_x0000_t94" style="position:absolute;margin-left:348.85pt;margin-top:3.05pt;width:29.25pt;height:7.15pt;z-index:251657728"/>
       </w:pict>
     </w:r>
     <w:r>
@@ -7984,6 +8040,12 @@
         <w:szCs w:val="18"/>
       </w:rPr>
       <w:tab/>
+    </w:r>
+    <w:r>
+      <w:rPr>
+        <w:sz w:val="18"/>
+        <w:szCs w:val="18"/>
+      </w:rPr>
       <w:t>______________________________</w:t>
     </w:r>
   </w:p>
@@ -8003,8 +8065,8 @@
 </w:ftr>
 </file>
 
-<file path=word/footer3.xml><?xml version="1.0" encoding="utf-8"?>
-<w:ftr xmlns:wpc="http://schemas.microsoft.com/office/word/2010/wordprocessingCanvas" xmlns:cx="http://schemas.microsoft.com/office/drawing/2014/chartex" xmlns:cx1="http://schemas.microsoft.com/office/drawing/2015/9/8/chartex" xmlns:mc="http://schemas.openxmlformats.org/markup-compatibility/2006" xmlns:o="urn:schemas-microsoft-com:office:office" xmlns:r="http://schemas.openxmlformats.org/officeDocument/2006/relationships" xmlns:m="http://schemas.openxmlformats.org/officeDocument/2006/math" xmlns:v="urn:schemas-microsoft-com:vml" xmlns:wp14="http://schemas.microsoft.com/office/word/2010/wordprocessingDrawing" xmlns:wp="http://schemas.openxmlformats.org/drawingml/2006/wordprocessingDrawing" xmlns:w10="urn:schemas-microsoft-com:office:word" xmlns:w="http://schemas.openxmlformats.org/wordprocessingml/2006/main" xmlns:w14="http://schemas.microsoft.com/office/word/2010/wordml" xmlns:w15="http://schemas.microsoft.com/office/word/2012/wordml" xmlns:w16se="http://schemas.microsoft.com/office/word/2015/wordml/symex" xmlns:wpg="http://schemas.microsoft.com/office/word/2010/wordprocessingGroup" xmlns:wpi="http://schemas.microsoft.com/office/word/2010/wordprocessingInk" xmlns:wne="http://schemas.microsoft.com/office/word/2006/wordml" xmlns:wps="http://schemas.microsoft.com/office/word/2010/wordprocessingShape" mc:Ignorable="w14 w15 w16se wp14">
+<file path=word/footer2.xml><?xml version="1.0" encoding="utf-8"?>
+<w:ftr xmlns:ve="http://schemas.openxmlformats.org/markup-compatibility/2006" xmlns:o="urn:schemas-microsoft-com:office:office" xmlns:r="http://schemas.openxmlformats.org/officeDocument/2006/relationships" xmlns:m="http://schemas.openxmlformats.org/officeDocument/2006/math" xmlns:v="urn:schemas-microsoft-com:vml" xmlns:wp="http://schemas.openxmlformats.org/drawingml/2006/wordprocessingDrawing" xmlns:w10="urn:schemas-microsoft-com:office:word" xmlns:w="http://schemas.openxmlformats.org/wordprocessingml/2006/main" xmlns:wne="http://schemas.microsoft.com/office/word/2006/wordml">
   <w:p>
     <w:pPr>
       <w:pStyle w:val="ae"/>
@@ -8013,18 +8075,8 @@
 </w:ftr>
 </file>
 
-<file path=word/footer4.xml><?xml version="1.0" encoding="utf-8"?>
-<w:ftr xmlns:wpc="http://schemas.microsoft.com/office/word/2010/wordprocessingCanvas" xmlns:cx="http://schemas.microsoft.com/office/drawing/2014/chartex" xmlns:cx1="http://schemas.microsoft.com/office/drawing/2015/9/8/chartex" xmlns:mc="http://schemas.openxmlformats.org/markup-compatibility/2006" xmlns:o="urn:schemas-microsoft-com:office:office" xmlns:r="http://schemas.openxmlformats.org/officeDocument/2006/relationships" xmlns:m="http://schemas.openxmlformats.org/officeDocument/2006/math" xmlns:v="urn:schemas-microsoft-com:vml" xmlns:wp14="http://schemas.microsoft.com/office/word/2010/wordprocessingDrawing" xmlns:wp="http://schemas.openxmlformats.org/drawingml/2006/wordprocessingDrawing" xmlns:w10="urn:schemas-microsoft-com:office:word" xmlns:w="http://schemas.openxmlformats.org/wordprocessingml/2006/main" xmlns:w14="http://schemas.microsoft.com/office/word/2010/wordml" xmlns:w15="http://schemas.microsoft.com/office/word/2012/wordml" xmlns:w16se="http://schemas.microsoft.com/office/word/2015/wordml/symex" xmlns:wpg="http://schemas.microsoft.com/office/word/2010/wordprocessingGroup" xmlns:wpi="http://schemas.microsoft.com/office/word/2010/wordprocessingInk" xmlns:wne="http://schemas.microsoft.com/office/word/2006/wordml" xmlns:wps="http://schemas.microsoft.com/office/word/2010/wordprocessingShape" mc:Ignorable="w14 w15 w16se wp14">
-  <w:p>
-    <w:pPr>
-      <w:pStyle w:val="ae"/>
-    </w:pPr>
-  </w:p>
-</w:ftr>
-</file>
-
-<file path=word/footer5.xml><?xml version="1.0" encoding="utf-8"?>
-<w:ftr xmlns:wpc="http://schemas.microsoft.com/office/word/2010/wordprocessingCanvas" xmlns:cx="http://schemas.microsoft.com/office/drawing/2014/chartex" xmlns:cx1="http://schemas.microsoft.com/office/drawing/2015/9/8/chartex" xmlns:mc="http://schemas.openxmlformats.org/markup-compatibility/2006" xmlns:o="urn:schemas-microsoft-com:office:office" xmlns:r="http://schemas.openxmlformats.org/officeDocument/2006/relationships" xmlns:m="http://schemas.openxmlformats.org/officeDocument/2006/math" xmlns:v="urn:schemas-microsoft-com:vml" xmlns:wp14="http://schemas.microsoft.com/office/word/2010/wordprocessingDrawing" xmlns:wp="http://schemas.openxmlformats.org/drawingml/2006/wordprocessingDrawing" xmlns:w10="urn:schemas-microsoft-com:office:word" xmlns:w="http://schemas.openxmlformats.org/wordprocessingml/2006/main" xmlns:w14="http://schemas.microsoft.com/office/word/2010/wordml" xmlns:w15="http://schemas.microsoft.com/office/word/2012/wordml" xmlns:w16se="http://schemas.microsoft.com/office/word/2015/wordml/symex" xmlns:wpg="http://schemas.microsoft.com/office/word/2010/wordprocessingGroup" xmlns:wpi="http://schemas.microsoft.com/office/word/2010/wordprocessingInk" xmlns:wne="http://schemas.microsoft.com/office/word/2006/wordml" xmlns:wps="http://schemas.microsoft.com/office/word/2010/wordprocessingShape" mc:Ignorable="w14 w15 w16se wp14">
+<file path=word/footer3.xml><?xml version="1.0" encoding="utf-8"?>
+<w:ftr xmlns:ve="http://schemas.openxmlformats.org/markup-compatibility/2006" xmlns:o="urn:schemas-microsoft-com:office:office" xmlns:r="http://schemas.openxmlformats.org/officeDocument/2006/relationships" xmlns:m="http://schemas.openxmlformats.org/officeDocument/2006/math" xmlns:v="urn:schemas-microsoft-com:vml" xmlns:wp="http://schemas.openxmlformats.org/drawingml/2006/wordprocessingDrawing" xmlns:w10="urn:schemas-microsoft-com:office:word" xmlns:w="http://schemas.openxmlformats.org/wordprocessingml/2006/main" xmlns:wne="http://schemas.microsoft.com/office/word/2006/wordml">
   <w:p>
     <w:pPr>
       <w:pStyle w:val="ae"/>
@@ -8034,15 +8086,15 @@
 </file>
 
 <file path=word/footnotes.xml><?xml version="1.0" encoding="utf-8"?>
-<w:footnotes xmlns:wpc="http://schemas.microsoft.com/office/word/2010/wordprocessingCanvas" xmlns:cx="http://schemas.microsoft.com/office/drawing/2014/chartex" xmlns:cx1="http://schemas.microsoft.com/office/drawing/2015/9/8/chartex" xmlns:mc="http://schemas.openxmlformats.org/markup-compatibility/2006" xmlns:o="urn:schemas-microsoft-com:office:office" xmlns:r="http://schemas.openxmlformats.org/officeDocument/2006/relationships" xmlns:m="http://schemas.openxmlformats.org/officeDocument/2006/math" xmlns:v="urn:schemas-microsoft-com:vml" xmlns:wp14="http://schemas.microsoft.com/office/word/2010/wordprocessingDrawing" xmlns:wp="http://schemas.openxmlformats.org/drawingml/2006/wordprocessingDrawing" xmlns:w10="urn:schemas-microsoft-com:office:word" xmlns:w="http://schemas.openxmlformats.org/wordprocessingml/2006/main" xmlns:w14="http://schemas.microsoft.com/office/word/2010/wordml" xmlns:w15="http://schemas.microsoft.com/office/word/2012/wordml" xmlns:w16se="http://schemas.microsoft.com/office/word/2015/wordml/symex" xmlns:wpg="http://schemas.microsoft.com/office/word/2010/wordprocessingGroup" xmlns:wpi="http://schemas.microsoft.com/office/word/2010/wordprocessingInk" xmlns:wne="http://schemas.microsoft.com/office/word/2006/wordml" xmlns:wps="http://schemas.microsoft.com/office/word/2010/wordprocessingShape" mc:Ignorable="w14 w15 w16se wp14">
-  <w:footnote w:type="separator" w:id="-1">
+<w:footnotes xmlns:ve="http://schemas.openxmlformats.org/markup-compatibility/2006" xmlns:o="urn:schemas-microsoft-com:office:office" xmlns:r="http://schemas.openxmlformats.org/officeDocument/2006/relationships" xmlns:m="http://schemas.openxmlformats.org/officeDocument/2006/math" xmlns:v="urn:schemas-microsoft-com:vml" xmlns:wp="http://schemas.openxmlformats.org/drawingml/2006/wordprocessingDrawing" xmlns:w10="urn:schemas-microsoft-com:office:word" xmlns:w="http://schemas.openxmlformats.org/wordprocessingml/2006/main" xmlns:wne="http://schemas.microsoft.com/office/word/2006/wordml">
+  <w:footnote w:type="separator" w:id="0">
     <w:p>
       <w:r>
         <w:separator/>
       </w:r>
     </w:p>
   </w:footnote>
-  <w:footnote w:type="continuationSeparator" w:id="0">
+  <w:footnote w:type="continuationSeparator" w:id="1">
     <w:p>
       <w:r>
         <w:continuationSeparator/>
@@ -8052,83 +8104,9 @@
 </w:footnotes>
 </file>
 
-<file path=word/header1.xml><?xml version="1.0" encoding="utf-8"?>
-<w:hdr xmlns:wpc="http://schemas.microsoft.com/office/word/2010/wordprocessingCanvas" xmlns:cx="http://schemas.microsoft.com/office/drawing/2014/chartex" xmlns:cx1="http://schemas.microsoft.com/office/drawing/2015/9/8/chartex" xmlns:mc="http://schemas.openxmlformats.org/markup-compatibility/2006" xmlns:o="urn:schemas-microsoft-com:office:office" xmlns:r="http://schemas.openxmlformats.org/officeDocument/2006/relationships" xmlns:m="http://schemas.openxmlformats.org/officeDocument/2006/math" xmlns:v="urn:schemas-microsoft-com:vml" xmlns:wp14="http://schemas.microsoft.com/office/word/2010/wordprocessingDrawing" xmlns:wp="http://schemas.openxmlformats.org/drawingml/2006/wordprocessingDrawing" xmlns:w10="urn:schemas-microsoft-com:office:word" xmlns:w="http://schemas.openxmlformats.org/wordprocessingml/2006/main" xmlns:w14="http://schemas.microsoft.com/office/word/2010/wordml" xmlns:w15="http://schemas.microsoft.com/office/word/2012/wordml" xmlns:w16se="http://schemas.microsoft.com/office/word/2015/wordml/symex" xmlns:wpg="http://schemas.microsoft.com/office/word/2010/wordprocessingGroup" xmlns:wpi="http://schemas.microsoft.com/office/word/2010/wordprocessingInk" xmlns:wne="http://schemas.microsoft.com/office/word/2006/wordml" xmlns:wps="http://schemas.microsoft.com/office/word/2010/wordprocessingShape" mc:Ignorable="w14 w15 w16se wp14">
-  <w:p>
-    <w:pPr>
-      <w:pStyle w:val="ac"/>
-    </w:pPr>
-  </w:p>
-</w:hdr>
-</file>
-
-<file path=word/header2.xml><?xml version="1.0" encoding="utf-8"?>
-<w:hdr xmlns:wpc="http://schemas.microsoft.com/office/word/2010/wordprocessingCanvas" xmlns:cx="http://schemas.microsoft.com/office/drawing/2014/chartex" xmlns:cx1="http://schemas.microsoft.com/office/drawing/2015/9/8/chartex" xmlns:mc="http://schemas.openxmlformats.org/markup-compatibility/2006" xmlns:o="urn:schemas-microsoft-com:office:office" xmlns:r="http://schemas.openxmlformats.org/officeDocument/2006/relationships" xmlns:m="http://schemas.openxmlformats.org/officeDocument/2006/math" xmlns:v="urn:schemas-microsoft-com:vml" xmlns:wp14="http://schemas.microsoft.com/office/word/2010/wordprocessingDrawing" xmlns:wp="http://schemas.openxmlformats.org/drawingml/2006/wordprocessingDrawing" xmlns:w10="urn:schemas-microsoft-com:office:word" xmlns:w="http://schemas.openxmlformats.org/wordprocessingml/2006/main" xmlns:w14="http://schemas.microsoft.com/office/word/2010/wordml" xmlns:w15="http://schemas.microsoft.com/office/word/2012/wordml" xmlns:w16se="http://schemas.microsoft.com/office/word/2015/wordml/symex" xmlns:wpg="http://schemas.microsoft.com/office/word/2010/wordprocessingGroup" xmlns:wpi="http://schemas.microsoft.com/office/word/2010/wordprocessingInk" xmlns:wne="http://schemas.microsoft.com/office/word/2006/wordml" xmlns:wps="http://schemas.microsoft.com/office/word/2010/wordprocessingShape" mc:Ignorable="w14 w15 w16se wp14">
-  <w:sdt>
-    <w:sdtPr>
-      <w:id w:val="-1903135015"/>
-      <w:docPartObj>
-        <w:docPartGallery w:val="Watermarks"/>
-        <w:docPartUnique/>
-      </w:docPartObj>
-    </w:sdtPr>
-    <w:sdtContent>
-      <w:p>
-        <w:pPr>
-          <w:pStyle w:val="ac"/>
-        </w:pPr>
-        <w:r>
-          <w:pict>
-            <v:shapetype id="_x0000_t136" coordsize="21600,21600" o:spt="136" adj="10800" path="m@7,l@8,m@5,21600l@6,21600e">
-              <v:formulas>
-                <v:f eqn="sum #0 0 10800"/>
-                <v:f eqn="prod #0 2 1"/>
-                <v:f eqn="sum 21600 0 @1"/>
-                <v:f eqn="sum 0 0 @2"/>
-                <v:f eqn="sum 21600 0 @3"/>
-                <v:f eqn="if @0 @3 0"/>
-                <v:f eqn="if @0 21600 @1"/>
-                <v:f eqn="if @0 0 @2"/>
-                <v:f eqn="if @0 @4 21600"/>
-                <v:f eqn="mid @5 @6"/>
-                <v:f eqn="mid @8 @5"/>
-                <v:f eqn="mid @7 @8"/>
-                <v:f eqn="mid @6 @7"/>
-                <v:f eqn="sum @6 0 @5"/>
-              </v:formulas>
-              <v:path textpathok="t" o:connecttype="custom" o:connectlocs="@9,0;@10,10800;@11,21600;@12,10800" o:connectangles="270,180,90,0"/>
-              <v:textpath on="t" fitshape="t"/>
-              <v:handles>
-                <v:h position="#0,bottomRight" xrange="6629,14971"/>
-              </v:handles>
-              <o:lock v:ext="edit" text="t" shapetype="t"/>
-            </v:shapetype>
-            <v:shape id="PowerPlusWaterMarkObject357922611" o:spid="_x0000_s2052" type="#_x0000_t136" style="position:absolute;margin-left:0;margin-top:0;width:461.85pt;height:197.95pt;rotation:315;z-index:-251655168;mso-position-horizontal:center;mso-position-horizontal-relative:margin;mso-position-vertical:center;mso-position-vertical-relative:margin" o:allowincell="f" fillcolor="silver" stroked="f">
-              <v:fill opacity=".5"/>
-              <v:textpath style="font-family:&quot;calibri&quot;;font-size:1pt" string="ОБРАЗЕЦ"/>
-              <w10:wrap anchorx="margin" anchory="margin"/>
-            </v:shape>
-          </w:pict>
-        </w:r>
-      </w:p>
-    </w:sdtContent>
-  </w:sdt>
-</w:hdr>
-</file>
-
-<file path=word/header3.xml><?xml version="1.0" encoding="utf-8"?>
-<w:hdr xmlns:wpc="http://schemas.microsoft.com/office/word/2010/wordprocessingCanvas" xmlns:cx="http://schemas.microsoft.com/office/drawing/2014/chartex" xmlns:cx1="http://schemas.microsoft.com/office/drawing/2015/9/8/chartex" xmlns:mc="http://schemas.openxmlformats.org/markup-compatibility/2006" xmlns:o="urn:schemas-microsoft-com:office:office" xmlns:r="http://schemas.openxmlformats.org/officeDocument/2006/relationships" xmlns:m="http://schemas.openxmlformats.org/officeDocument/2006/math" xmlns:v="urn:schemas-microsoft-com:vml" xmlns:wp14="http://schemas.microsoft.com/office/word/2010/wordprocessingDrawing" xmlns:wp="http://schemas.openxmlformats.org/drawingml/2006/wordprocessingDrawing" xmlns:w10="urn:schemas-microsoft-com:office:word" xmlns:w="http://schemas.openxmlformats.org/wordprocessingml/2006/main" xmlns:w14="http://schemas.microsoft.com/office/word/2010/wordml" xmlns:w15="http://schemas.microsoft.com/office/word/2012/wordml" xmlns:w16se="http://schemas.microsoft.com/office/word/2015/wordml/symex" xmlns:wpg="http://schemas.microsoft.com/office/word/2010/wordprocessingGroup" xmlns:wpi="http://schemas.microsoft.com/office/word/2010/wordprocessingInk" xmlns:wne="http://schemas.microsoft.com/office/word/2006/wordml" xmlns:wps="http://schemas.microsoft.com/office/word/2010/wordprocessingShape" mc:Ignorable="w14 w15 w16se wp14">
-  <w:p>
-    <w:pPr>
-      <w:pStyle w:val="ac"/>
-    </w:pPr>
-  </w:p>
-</w:hdr>
-</file>
-
 <file path=word/numbering.xml><?xml version="1.0" encoding="utf-8"?>
-<w:numbering xmlns:wpc="http://schemas.microsoft.com/office/word/2010/wordprocessingCanvas" xmlns:cx="http://schemas.microsoft.com/office/drawing/2014/chartex" xmlns:cx1="http://schemas.microsoft.com/office/drawing/2015/9/8/chartex" xmlns:mc="http://schemas.openxmlformats.org/markup-compatibility/2006" xmlns:o="urn:schemas-microsoft-com:office:office" xmlns:r="http://schemas.openxmlformats.org/officeDocument/2006/relationships" xmlns:m="http://schemas.openxmlformats.org/officeDocument/2006/math" xmlns:v="urn:schemas-microsoft-com:vml" xmlns:wp14="http://schemas.microsoft.com/office/word/2010/wordprocessingDrawing" xmlns:wp="http://schemas.openxmlformats.org/drawingml/2006/wordprocessingDrawing" xmlns:w10="urn:schemas-microsoft-com:office:word" xmlns:w="http://schemas.openxmlformats.org/wordprocessingml/2006/main" xmlns:w14="http://schemas.microsoft.com/office/word/2010/wordml" xmlns:w15="http://schemas.microsoft.com/office/word/2012/wordml" xmlns:w16se="http://schemas.microsoft.com/office/word/2015/wordml/symex" xmlns:wpg="http://schemas.microsoft.com/office/word/2010/wordprocessingGroup" xmlns:wpi="http://schemas.microsoft.com/office/word/2010/wordprocessingInk" xmlns:wne="http://schemas.microsoft.com/office/word/2006/wordml" xmlns:wps="http://schemas.microsoft.com/office/word/2010/wordprocessingShape" mc:Ignorable="w14 w15 w16se wp14">
-  <w:abstractNum w:abstractNumId="0" w15:restartNumberingAfterBreak="0">
+<w:numbering xmlns:ve="http://schemas.openxmlformats.org/markup-compatibility/2006" xmlns:o="urn:schemas-microsoft-com:office:office" xmlns:r="http://schemas.openxmlformats.org/officeDocument/2006/relationships" xmlns:m="http://schemas.openxmlformats.org/officeDocument/2006/math" xmlns:v="urn:schemas-microsoft-com:vml" xmlns:wp="http://schemas.openxmlformats.org/drawingml/2006/wordprocessingDrawing" xmlns:w10="urn:schemas-microsoft-com:office:word" xmlns:w="http://schemas.openxmlformats.org/wordprocessingml/2006/main" xmlns:wne="http://schemas.microsoft.com/office/word/2006/wordml">
+  <w:abstractNum w:abstractNumId="0">
     <w:nsid w:val="620F168F"/>
     <w:multiLevelType w:val="multilevel"/>
     <w:tmpl w:val="F1F49DA8"/>
@@ -8285,7 +8263,7 @@
 </file>
 
 <file path=word/styles.xml><?xml version="1.0" encoding="utf-8"?>
-<w:styles xmlns:mc="http://schemas.openxmlformats.org/markup-compatibility/2006" xmlns:r="http://schemas.openxmlformats.org/officeDocument/2006/relationships" xmlns:w="http://schemas.openxmlformats.org/wordprocessingml/2006/main" xmlns:w14="http://schemas.microsoft.com/office/word/2010/wordml" xmlns:w15="http://schemas.microsoft.com/office/word/2012/wordml" xmlns:w16se="http://schemas.microsoft.com/office/word/2015/wordml/symex" mc:Ignorable="w14 w15 w16se">
+<w:styles xmlns:r="http://schemas.openxmlformats.org/officeDocument/2006/relationships" xmlns:w="http://schemas.openxmlformats.org/wordprocessingml/2006/main">
   <w:docDefaults>
     <w:rPrDefault>
       <w:rPr>
@@ -8295,7 +8273,7 @@
     </w:rPrDefault>
     <w:pPrDefault/>
   </w:docDefaults>
-  <w:latentStyles w:defLockedState="0" w:defUIPriority="0" w:defSemiHidden="0" w:defUnhideWhenUsed="0" w:defQFormat="0" w:count="371">
+  <w:latentStyles w:defLockedState="0" w:defUIPriority="0" w:defSemiHidden="0" w:defUnhideWhenUsed="0" w:defQFormat="0" w:count="267">
     <w:lsdException w:name="Normal" w:qFormat="1"/>
     <w:lsdException w:name="heading 1" w:qFormat="1"/>
     <w:lsdException w:name="heading 2" w:semiHidden="1" w:unhideWhenUsed="1" w:qFormat="1"/>
@@ -8306,101 +8284,12 @@
     <w:lsdException w:name="heading 7" w:semiHidden="1" w:unhideWhenUsed="1" w:qFormat="1"/>
     <w:lsdException w:name="heading 8" w:semiHidden="1" w:unhideWhenUsed="1" w:qFormat="1"/>
     <w:lsdException w:name="heading 9" w:semiHidden="1" w:unhideWhenUsed="1" w:qFormat="1"/>
-    <w:lsdException w:name="index 1" w:semiHidden="1" w:unhideWhenUsed="1"/>
-    <w:lsdException w:name="index 2" w:semiHidden="1" w:unhideWhenUsed="1"/>
-    <w:lsdException w:name="index 3" w:semiHidden="1" w:unhideWhenUsed="1"/>
-    <w:lsdException w:name="index 4" w:semiHidden="1" w:unhideWhenUsed="1"/>
-    <w:lsdException w:name="index 5" w:semiHidden="1" w:unhideWhenUsed="1"/>
-    <w:lsdException w:name="index 6" w:semiHidden="1" w:unhideWhenUsed="1"/>
-    <w:lsdException w:name="index 7" w:semiHidden="1" w:unhideWhenUsed="1"/>
-    <w:lsdException w:name="index 8" w:semiHidden="1" w:unhideWhenUsed="1"/>
-    <w:lsdException w:name="index 9" w:semiHidden="1" w:unhideWhenUsed="1"/>
-    <w:lsdException w:name="toc 1" w:semiHidden="1" w:unhideWhenUsed="1"/>
-    <w:lsdException w:name="toc 2" w:semiHidden="1" w:unhideWhenUsed="1"/>
-    <w:lsdException w:name="toc 3" w:semiHidden="1" w:unhideWhenUsed="1"/>
-    <w:lsdException w:name="toc 4" w:semiHidden="1" w:unhideWhenUsed="1"/>
-    <w:lsdException w:name="toc 5" w:semiHidden="1" w:unhideWhenUsed="1"/>
-    <w:lsdException w:name="toc 6" w:semiHidden="1" w:unhideWhenUsed="1"/>
-    <w:lsdException w:name="toc 7" w:semiHidden="1" w:unhideWhenUsed="1"/>
-    <w:lsdException w:name="toc 8" w:semiHidden="1" w:unhideWhenUsed="1"/>
-    <w:lsdException w:name="toc 9" w:semiHidden="1" w:unhideWhenUsed="1"/>
-    <w:lsdException w:name="Normal Indent" w:semiHidden="1" w:unhideWhenUsed="1"/>
-    <w:lsdException w:name="footnote text" w:semiHidden="1" w:unhideWhenUsed="1"/>
-    <w:lsdException w:name="annotation text" w:semiHidden="1" w:unhideWhenUsed="1"/>
-    <w:lsdException w:name="header" w:semiHidden="1" w:unhideWhenUsed="1"/>
-    <w:lsdException w:name="footer" w:semiHidden="1" w:unhideWhenUsed="1"/>
-    <w:lsdException w:name="index heading" w:semiHidden="1" w:unhideWhenUsed="1"/>
     <w:lsdException w:name="caption" w:semiHidden="1" w:unhideWhenUsed="1" w:qFormat="1"/>
-    <w:lsdException w:name="table of figures" w:semiHidden="1" w:unhideWhenUsed="1"/>
-    <w:lsdException w:name="envelope address" w:semiHidden="1" w:unhideWhenUsed="1"/>
-    <w:lsdException w:name="envelope return" w:semiHidden="1" w:unhideWhenUsed="1"/>
-    <w:lsdException w:name="footnote reference" w:semiHidden="1" w:unhideWhenUsed="1"/>
-    <w:lsdException w:name="annotation reference" w:semiHidden="1" w:unhideWhenUsed="1"/>
-    <w:lsdException w:name="line number" w:semiHidden="1" w:unhideWhenUsed="1"/>
-    <w:lsdException w:name="page number" w:semiHidden="1" w:unhideWhenUsed="1"/>
-    <w:lsdException w:name="endnote reference" w:semiHidden="1" w:unhideWhenUsed="1"/>
-    <w:lsdException w:name="endnote text" w:semiHidden="1" w:unhideWhenUsed="1"/>
-    <w:lsdException w:name="table of authorities" w:semiHidden="1" w:unhideWhenUsed="1"/>
-    <w:lsdException w:name="macro" w:semiHidden="1" w:unhideWhenUsed="1"/>
-    <w:lsdException w:name="toa heading" w:semiHidden="1" w:unhideWhenUsed="1"/>
-    <w:lsdException w:name="List" w:semiHidden="1" w:unhideWhenUsed="1"/>
-    <w:lsdException w:name="List Bullet" w:semiHidden="1" w:unhideWhenUsed="1"/>
-    <w:lsdException w:name="List 2" w:semiHidden="1" w:unhideWhenUsed="1"/>
-    <w:lsdException w:name="List 3" w:semiHidden="1" w:unhideWhenUsed="1"/>
-    <w:lsdException w:name="List Bullet 2" w:semiHidden="1" w:unhideWhenUsed="1"/>
-    <w:lsdException w:name="List Bullet 3" w:semiHidden="1" w:unhideWhenUsed="1"/>
-    <w:lsdException w:name="List Bullet 4" w:semiHidden="1" w:unhideWhenUsed="1"/>
-    <w:lsdException w:name="List Bullet 5" w:semiHidden="1" w:unhideWhenUsed="1"/>
-    <w:lsdException w:name="List Number 2" w:semiHidden="1" w:unhideWhenUsed="1"/>
-    <w:lsdException w:name="List Number 3" w:semiHidden="1" w:unhideWhenUsed="1"/>
-    <w:lsdException w:name="List Number 4" w:semiHidden="1" w:unhideWhenUsed="1"/>
-    <w:lsdException w:name="List Number 5" w:semiHidden="1" w:unhideWhenUsed="1"/>
     <w:lsdException w:name="Title" w:qFormat="1"/>
-    <w:lsdException w:name="Closing" w:semiHidden="1" w:unhideWhenUsed="1"/>
-    <w:lsdException w:name="Signature" w:semiHidden="1" w:unhideWhenUsed="1"/>
-    <w:lsdException w:name="Default Paragraph Font" w:semiHidden="1" w:unhideWhenUsed="1"/>
-    <w:lsdException w:name="Body Text" w:semiHidden="1" w:unhideWhenUsed="1"/>
-    <w:lsdException w:name="Body Text Indent" w:semiHidden="1" w:unhideWhenUsed="1"/>
-    <w:lsdException w:name="List Continue" w:semiHidden="1" w:unhideWhenUsed="1"/>
-    <w:lsdException w:name="List Continue 2" w:semiHidden="1" w:unhideWhenUsed="1"/>
-    <w:lsdException w:name="List Continue 3" w:semiHidden="1" w:unhideWhenUsed="1"/>
-    <w:lsdException w:name="List Continue 4" w:semiHidden="1" w:unhideWhenUsed="1"/>
-    <w:lsdException w:name="List Continue 5" w:semiHidden="1" w:unhideWhenUsed="1"/>
-    <w:lsdException w:name="Message Header" w:semiHidden="1" w:unhideWhenUsed="1"/>
     <w:lsdException w:name="Subtitle" w:qFormat="1"/>
-    <w:lsdException w:name="Body Text First Indent 2" w:semiHidden="1" w:unhideWhenUsed="1"/>
-    <w:lsdException w:name="Note Heading" w:semiHidden="1" w:unhideWhenUsed="1"/>
-    <w:lsdException w:name="Body Text 2" w:semiHidden="1" w:unhideWhenUsed="1"/>
-    <w:lsdException w:name="Body Text 3" w:semiHidden="1" w:unhideWhenUsed="1"/>
-    <w:lsdException w:name="Body Text Indent 2" w:semiHidden="1" w:unhideWhenUsed="1"/>
-    <w:lsdException w:name="Body Text Indent 3" w:semiHidden="1" w:unhideWhenUsed="1"/>
-    <w:lsdException w:name="Block Text" w:semiHidden="1" w:unhideWhenUsed="1"/>
-    <w:lsdException w:name="Hyperlink" w:semiHidden="1" w:unhideWhenUsed="1"/>
-    <w:lsdException w:name="FollowedHyperlink" w:semiHidden="1" w:unhideWhenUsed="1"/>
     <w:lsdException w:name="Strong" w:qFormat="1"/>
     <w:lsdException w:name="Emphasis" w:qFormat="1"/>
-    <w:lsdException w:name="Document Map" w:semiHidden="1" w:unhideWhenUsed="1"/>
-    <w:lsdException w:name="Plain Text" w:semiHidden="1" w:unhideWhenUsed="1"/>
-    <w:lsdException w:name="E-mail Signature" w:semiHidden="1" w:unhideWhenUsed="1"/>
-    <w:lsdException w:name="HTML Top of Form" w:semiHidden="1" w:unhideWhenUsed="1"/>
-    <w:lsdException w:name="HTML Bottom of Form" w:semiHidden="1" w:unhideWhenUsed="1"/>
-    <w:lsdException w:name="Normal (Web)" w:semiHidden="1" w:unhideWhenUsed="1"/>
-    <w:lsdException w:name="HTML Acronym" w:semiHidden="1" w:unhideWhenUsed="1"/>
-    <w:lsdException w:name="HTML Address" w:semiHidden="1" w:unhideWhenUsed="1"/>
-    <w:lsdException w:name="HTML Cite" w:semiHidden="1" w:unhideWhenUsed="1"/>
-    <w:lsdException w:name="HTML Code" w:semiHidden="1" w:unhideWhenUsed="1"/>
-    <w:lsdException w:name="HTML Definition" w:semiHidden="1" w:unhideWhenUsed="1"/>
-    <w:lsdException w:name="HTML Keyboard" w:semiHidden="1" w:unhideWhenUsed="1"/>
-    <w:lsdException w:name="HTML Preformatted" w:semiHidden="1" w:unhideWhenUsed="1"/>
-    <w:lsdException w:name="HTML Sample" w:semiHidden="1" w:unhideWhenUsed="1"/>
-    <w:lsdException w:name="HTML Typewriter" w:semiHidden="1" w:unhideWhenUsed="1"/>
-    <w:lsdException w:name="HTML Variable" w:semiHidden="1" w:unhideWhenUsed="1"/>
     <w:lsdException w:name="Normal Table" w:semiHidden="1" w:unhideWhenUsed="1"/>
-    <w:lsdException w:name="annotation subject" w:semiHidden="1" w:unhideWhenUsed="1"/>
-    <w:lsdException w:name="No List" w:semiHidden="1" w:unhideWhenUsed="1"/>
-    <w:lsdException w:name="Outline List 1" w:semiHidden="1" w:unhideWhenUsed="1"/>
-    <w:lsdException w:name="Outline List 2" w:semiHidden="1" w:unhideWhenUsed="1"/>
-    <w:lsdException w:name="Outline List 3" w:semiHidden="1" w:unhideWhenUsed="1"/>
     <w:lsdException w:name="Table Simple 1" w:semiHidden="1" w:unhideWhenUsed="1"/>
     <w:lsdException w:name="Table Simple 2" w:semiHidden="1" w:unhideWhenUsed="1"/>
     <w:lsdException w:name="Table Simple 3" w:semiHidden="1" w:unhideWhenUsed="1"/>
@@ -8443,7 +8332,6 @@
     <w:lsdException w:name="Table Web 1" w:semiHidden="1" w:unhideWhenUsed="1"/>
     <w:lsdException w:name="Table Web 2" w:semiHidden="1" w:unhideWhenUsed="1"/>
     <w:lsdException w:name="Table Web 3" w:semiHidden="1" w:unhideWhenUsed="1"/>
-    <w:lsdException w:name="Balloon Text" w:semiHidden="1" w:unhideWhenUsed="1"/>
     <w:lsdException w:name="Table Theme" w:semiHidden="1" w:unhideWhenUsed="1"/>
     <w:lsdException w:name="Placeholder Text" w:semiHidden="1" w:uiPriority="99"/>
     <w:lsdException w:name="No Spacing" w:uiPriority="1" w:qFormat="1"/>
@@ -8556,110 +8444,6 @@
     <w:lsdException w:name="Book Title" w:uiPriority="33" w:qFormat="1"/>
     <w:lsdException w:name="Bibliography" w:semiHidden="1" w:uiPriority="37" w:unhideWhenUsed="1"/>
     <w:lsdException w:name="TOC Heading" w:semiHidden="1" w:uiPriority="39" w:unhideWhenUsed="1" w:qFormat="1"/>
-    <w:lsdException w:name="Plain Table 1" w:uiPriority="41"/>
-    <w:lsdException w:name="Plain Table 2" w:uiPriority="42"/>
-    <w:lsdException w:name="Plain Table 3" w:uiPriority="43"/>
-    <w:lsdException w:name="Plain Table 4" w:uiPriority="44"/>
-    <w:lsdException w:name="Plain Table 5" w:uiPriority="45"/>
-    <w:lsdException w:name="Grid Table Light" w:uiPriority="40"/>
-    <w:lsdException w:name="Grid Table 1 Light" w:uiPriority="46"/>
-    <w:lsdException w:name="Grid Table 2" w:uiPriority="47"/>
-    <w:lsdException w:name="Grid Table 3" w:uiPriority="48"/>
-    <w:lsdException w:name="Grid Table 4" w:uiPriority="49"/>
-    <w:lsdException w:name="Grid Table 5 Dark" w:uiPriority="50"/>
-    <w:lsdException w:name="Grid Table 6 Colorful" w:uiPriority="51"/>
-    <w:lsdException w:name="Grid Table 7 Colorful" w:uiPriority="52"/>
-    <w:lsdException w:name="Grid Table 1 Light Accent 1" w:uiPriority="46"/>
-    <w:lsdException w:name="Grid Table 2 Accent 1" w:uiPriority="47"/>
-    <w:lsdException w:name="Grid Table 3 Accent 1" w:uiPriority="48"/>
-    <w:lsdException w:name="Grid Table 4 Accent 1" w:uiPriority="49"/>
-    <w:lsdException w:name="Grid Table 5 Dark Accent 1" w:uiPriority="50"/>
-    <w:lsdException w:name="Grid Table 6 Colorful Accent 1" w:uiPriority="51"/>
-    <w:lsdException w:name="Grid Table 7 Colorful Accent 1" w:uiPriority="52"/>
-    <w:lsdException w:name="Grid Table 1 Light Accent 2" w:uiPriority="46"/>
-    <w:lsdException w:name="Grid Table 2 Accent 2" w:uiPriority="47"/>
-    <w:lsdException w:name="Grid Table 3 Accent 2" w:uiPriority="48"/>
-    <w:lsdException w:name="Grid Table 4 Accent 2" w:uiPriority="49"/>
-    <w:lsdException w:name="Grid Table 5 Dark Accent 2" w:uiPriority="50"/>
-    <w:lsdException w:name="Grid Table 6 Colorful Accent 2" w:uiPriority="51"/>
-    <w:lsdException w:name="Grid Table 7 Colorful Accent 2" w:uiPriority="52"/>
-    <w:lsdException w:name="Grid Table 1 Light Accent 3" w:uiPriority="46"/>
-    <w:lsdException w:name="Grid Table 2 Accent 3" w:uiPriority="47"/>
-    <w:lsdException w:name="Grid Table 3 Accent 3" w:uiPriority="48"/>
-    <w:lsdException w:name="Grid Table 4 Accent 3" w:uiPriority="49"/>
-    <w:lsdException w:name="Grid Table 5 Dark Accent 3" w:uiPriority="50"/>
-    <w:lsdException w:name="Grid Table 6 Colorful Accent 3" w:uiPriority="51"/>
-    <w:lsdException w:name="Grid Table 7 Colorful Accent 3" w:uiPriority="52"/>
-    <w:lsdException w:name="Grid Table 1 Light Accent 4" w:uiPriority="46"/>
-    <w:lsdException w:name="Grid Table 2 Accent 4" w:uiPriority="47"/>
-    <w:lsdException w:name="Grid Table 3 Accent 4" w:uiPriority="48"/>
-    <w:lsdException w:name="Grid Table 4 Accent 4" w:uiPriority="49"/>
-    <w:lsdException w:name="Grid Table 5 Dark Accent 4" w:uiPriority="50"/>
-    <w:lsdException w:name="Grid Table 6 Colorful Accent 4" w:uiPriority="51"/>
-    <w:lsdException w:name="Grid Table 7 Colorful Accent 4" w:uiPriority="52"/>
-    <w:lsdException w:name="Grid Table 1 Light Accent 5" w:uiPriority="46"/>
-    <w:lsdException w:name="Grid Table 2 Accent 5" w:uiPriority="47"/>
-    <w:lsdException w:name="Grid Table 3 Accent 5" w:uiPriority="48"/>
-    <w:lsdException w:name="Grid Table 4 Accent 5" w:uiPriority="49"/>
-    <w:lsdException w:name="Grid Table 5 Dark Accent 5" w:uiPriority="50"/>
-    <w:lsdException w:name="Grid Table 6 Colorful Accent 5" w:uiPriority="51"/>
-    <w:lsdException w:name="Grid Table 7 Colorful Accent 5" w:uiPriority="52"/>
-    <w:lsdException w:name="Grid Table 1 Light Accent 6" w:uiPriority="46"/>
-    <w:lsdException w:name="Grid Table 2 Accent 6" w:uiPriority="47"/>
-    <w:lsdException w:name="Grid Table 3 Accent 6" w:uiPriority="48"/>
-    <w:lsdException w:name="Grid Table 4 Accent 6" w:uiPriority="49"/>
-    <w:lsdException w:name="Grid Table 5 Dark Accent 6" w:uiPriority="50"/>
-    <w:lsdException w:name="Grid Table 6 Colorful Accent 6" w:uiPriority="51"/>
-    <w:lsdException w:name="Grid Table 7 Colorful Accent 6" w:uiPriority="52"/>
-    <w:lsdException w:name="List Table 1 Light" w:uiPriority="46"/>
-    <w:lsdException w:name="List Table 2" w:uiPriority="47"/>
-    <w:lsdException w:name="List Table 3" w:uiPriority="48"/>
-    <w:lsdException w:name="List Table 4" w:uiPriority="49"/>
-    <w:lsdException w:name="List Table 5 Dark" w:uiPriority="50"/>
-    <w:lsdException w:name="List Table 6 Colorful" w:uiPriority="51"/>
-    <w:lsdException w:name="List Table 7 Colorful" w:uiPriority="52"/>
-    <w:lsdException w:name="List Table 1 Light Accent 1" w:uiPriority="46"/>
-    <w:lsdException w:name="List Table 2 Accent 1" w:uiPriority="47"/>
-    <w:lsdException w:name="List Table 3 Accent 1" w:uiPriority="48"/>
-    <w:lsdException w:name="List Table 4 Accent 1" w:uiPriority="49"/>
-    <w:lsdException w:name="List Table 5 Dark Accent 1" w:uiPriority="50"/>
-    <w:lsdException w:name="List Table 6 Colorful Accent 1" w:uiPriority="51"/>
-    <w:lsdException w:name="List Table 7 Colorful Accent 1" w:uiPriority="52"/>
-    <w:lsdException w:name="List Table 1 Light Accent 2" w:uiPriority="46"/>
-    <w:lsdException w:name="List Table 2 Accent 2" w:uiPriority="47"/>
-    <w:lsdException w:name="List Table 3 Accent 2" w:uiPriority="48"/>
-    <w:lsdException w:name="List Table 4 Accent 2" w:uiPriority="49"/>
-    <w:lsdException w:name="List Table 5 Dark Accent 2" w:uiPriority="50"/>
-    <w:lsdException w:name="List Table 6 Colorful Accent 2" w:uiPriority="51"/>
-    <w:lsdException w:name="List Table 7 Colorful Accent 2" w:uiPriority="52"/>
-    <w:lsdException w:name="List Table 1 Light Accent 3" w:uiPriority="46"/>
-    <w:lsdException w:name="List Table 2 Accent 3" w:uiPriority="47"/>
-    <w:lsdException w:name="List Table 3 Accent 3" w:uiPriority="48"/>
-    <w:lsdException w:name="List Table 4 Accent 3" w:uiPriority="49"/>
-    <w:lsdException w:name="List Table 5 Dark Accent 3" w:uiPriority="50"/>
-    <w:lsdException w:name="List Table 6 Colorful Accent 3" w:uiPriority="51"/>
-    <w:lsdException w:name="List Table 7 Colorful Accent 3" w:uiPriority="52"/>
-    <w:lsdException w:name="List Table 1 Light Accent 4" w:uiPriority="46"/>
-    <w:lsdException w:name="List Table 2 Accent 4" w:uiPriority="47"/>
-    <w:lsdException w:name="List Table 3 Accent 4" w:uiPriority="48"/>
-    <w:lsdException w:name="List Table 4 Accent 4" w:uiPriority="49"/>
-    <w:lsdException w:name="List Table 5 Dark Accent 4" w:uiPriority="50"/>
-    <w:lsdException w:name="List Table 6 Colorful Accent 4" w:uiPriority="51"/>
-    <w:lsdException w:name="List Table 7 Colorful Accent 4" w:uiPriority="52"/>
-    <w:lsdException w:name="List Table 1 Light Accent 5" w:uiPriority="46"/>
-    <w:lsdException w:name="List Table 2 Accent 5" w:uiPriority="47"/>
-    <w:lsdException w:name="List Table 3 Accent 5" w:uiPriority="48"/>
-    <w:lsdException w:name="List Table 4 Accent 5" w:uiPriority="49"/>
-    <w:lsdException w:name="List Table 5 Dark Accent 5" w:uiPriority="50"/>
-    <w:lsdException w:name="List Table 6 Colorful Accent 5" w:uiPriority="51"/>
-    <w:lsdException w:name="List Table 7 Colorful Accent 5" w:uiPriority="52"/>
-    <w:lsdException w:name="List Table 1 Light Accent 6" w:uiPriority="46"/>
-    <w:lsdException w:name="List Table 2 Accent 6" w:uiPriority="47"/>
-    <w:lsdException w:name="List Table 3 Accent 6" w:uiPriority="48"/>
-    <w:lsdException w:name="List Table 4 Accent 6" w:uiPriority="49"/>
-    <w:lsdException w:name="List Table 5 Dark Accent 6" w:uiPriority="50"/>
-    <w:lsdException w:name="List Table 6 Colorful Accent 6" w:uiPriority="51"/>
-    <w:lsdException w:name="List Table 7 Colorful Accent 6" w:uiPriority="52"/>
   </w:latentStyles>
   <w:style w:type="paragraph" w:default="1" w:styleId="a">
     <w:name w:val="Normal"/>
@@ -8702,6 +8486,7 @@
     <w:uiPriority w:val="99"/>
     <w:semiHidden/>
     <w:unhideWhenUsed/>
+    <w:qFormat/>
     <w:tblPr>
       <w:tblInd w:w="0" w:type="dxa"/>
       <w:tblCellMar>
@@ -8723,6 +8508,7 @@
     <w:basedOn w:val="a1"/>
     <w:rsid w:val="00EF2FDF"/>
     <w:tblPr>
+      <w:tblInd w:w="0" w:type="dxa"/>
       <w:tblBorders>
         <w:top w:val="single" w:sz="4" w:space="0" w:color="auto"/>
         <w:left w:val="single" w:sz="4" w:space="0" w:color="auto"/>
@@ -8731,6 +8517,12 @@
         <w:insideH w:val="single" w:sz="4" w:space="0" w:color="auto"/>
         <w:insideV w:val="single" w:sz="4" w:space="0" w:color="auto"/>
       </w:tblBorders>
+      <w:tblCellMar>
+        <w:top w:w="0" w:type="dxa"/>
+        <w:left w:w="108" w:type="dxa"/>
+        <w:bottom w:w="0" w:type="dxa"/>
+        <w:right w:w="108" w:type="dxa"/>
+      </w:tblCellMar>
     </w:tblPr>
   </w:style>
   <w:style w:type="character" w:customStyle="1" w:styleId="10">
@@ -9190,7 +8982,7 @@
   <a:extraClrSchemeLst/>
   <a:extLst>
     <a:ext uri="{05A4C25C-085E-4340-85A3-A5531E510DB2}">
-      <thm15:themeFamily xmlns:thm15="http://schemas.microsoft.com/office/thememl/2012/main" name="Office Theme" id="{62F939B6-93AF-4DB8-9C6B-D6C7DFDC589F}" vid="{4A3C46E8-61CC-4603-A589-7422A47A8E4A}"/>
+      <thm15:themeFamily xmlns:thm15="http://schemas.microsoft.com/office/thememl/2012/main" xmlns="" name="Office Theme" id="{62F939B6-93AF-4DB8-9C6B-D6C7DFDC589F}" vid="{4A3C46E8-61CC-4603-A589-7422A47A8E4A}"/>
     </a:ext>
   </a:extLst>
 </a:theme>
@@ -9201,7 +8993,7 @@
 </file>
 
 <file path=customXml/itemProps1.xml><?xml version="1.0" encoding="utf-8"?>
-<ds:datastoreItem xmlns:ds="http://schemas.openxmlformats.org/officeDocument/2006/customXml" ds:itemID="{5280B82C-C711-4FD9-9DC4-69720F6B936D}">
+<ds:datastoreItem xmlns:ds="http://schemas.openxmlformats.org/officeDocument/2006/customXml" ds:itemID="{B3730EE8-2272-4C2B-A2F4-531ACB6A4FD6}">
   <ds:schemaRefs>
     <ds:schemaRef ds:uri="http://schemas.openxmlformats.org/officeDocument/2006/bibliography"/>
   </ds:schemaRefs>

</xml_diff>